<commit_message>
Auditabbruch: Unterlagen an CADIS-Fachbereich übermitteln
Co-Authored-By: Claude Sonnet 5.5 <noreply@anthropic.com>
Claude-Session: https://claude.ai/code/session_01WyvNodyyJRof1fHMN8ju4o
</commit_message>
<xml_diff>
--- a/CADIS_Prozessbeschreibung_mit_Aenderungen.docx
+++ b/CADIS_Prozessbeschreibung_mit_Aenderungen.docx
@@ -4400,8 +4400,14 @@
       <w:r>
         <w:t xml:space="preserve">Auf Grundlage der Erkenntnisse entscheidet der Auditor, ob die Prüfung im geplanten Umfang fortgeführt, verschoben oder in Ausnahmefällen abgebrochen wird. Bei negativem Ergebnis wird das Unternehmen zur Nachbesserung aufgefordert. Insgesamt stehen maximal drei Einreichungsversuche zur Verfügung; als Einreichungsversuch gilt jede formale Übermittlung des Prüfkatalogs an den </w:t>
         <w:lastRenderedPageBreak/>
-        <w:t xml:space="preserve">Auditor. Nach dem dritten erfolglosen Versuch ist die Prüfung abzubrechen. Weitere Abbruchgründe, die Folgen eines Abbruchs sowie die Regeln zur Verschiebung sind im CADIS®-Handbuch, Kapitel 6.13, festgelegt.</w:t>
-      </w:r>
+        <w:t xml:space="preserve">Auditor. Nach dem dritten erfolglosen Versuch ist die Prüfung abzubrechen. Weitere Abbruchgründe, die Folgen eines Abbruchs sowie die Regeln zur Verschiebung sind </w:t>
+        <w:t xml:space="preserve">im CADIS®-Handbuch, Kapitel 6.13, festgelegt.</w:t>
+      </w:r>
+      <w:ins w:id="9601" w:author="Claude" w:date="2026-10-15T05:22:53Z">
+        <w:r>
+          <w:t xml:space="preserve"> Bei jedem Auditabbruch übermittelt der Auditor die bis dahin vorliegenden Unterlagen (ausgefüllter CADIS®-Prüfkatalog, JSON-Datei aus dem CADIS®-Audittool, Kick-Off-Material, Bestätigungsmail gemäß den CADIS®-Mailvorlagen) per E-Mail an den CADIS®-Fachbereich (CADIS@dekra.com); dieser entscheidet über das weitere Vorgehen.</w:t>
+        </w:r>
+      </w:ins>
     </w:p>
     <w:p>
       <w:pPr>

</xml_diff>

<commit_message>
Closing Meeting: Regelfall letzter Prüfungstag, Ausnahme remote max. 7 Tage
Co-Authored-By: Claude Sonnet 5.5 <noreply@anthropic.com>
Claude-Session: https://claude.ai/code/session_01WyvNodyyJRof1fHMN8ju4o
</commit_message>
<xml_diff>
--- a/CADIS_Prozessbeschreibung_mit_Aenderungen.docx
+++ b/CADIS_Prozessbeschreibung_mit_Aenderungen.docx
@@ -4775,23 +4775,16 @@
       <w:r>
         <w:t xml:space="preserve">Das Closing Meeting findet </w:t>
       </w:r>
-      <w:del w:id="11001" w:author="Claude" w:date="2026-10-25T13:35:03Z">
-        <w:r>
-          <w:delText xml:space="preserve">am letzten Tag der Prüfung</w:delText>
-        </w:r>
-      </w:del>
-      <w:ins w:id="11002" w:author="Claude" w:date="2026-10-25T13:35:03Z">
-        <w:r>
-          <w:t xml:space="preserve">im unmittelbaren Anschluss an die Phase 2</w:t>
-        </w:r>
-      </w:ins>
+      <w:r>
+        <w:t xml:space="preserve">am letzten Tag der Prüfung</w:t>
+      </w:r>
       <w:r>
         <w:t xml:space="preserve"> statt und </w:t>
         <w:t xml:space="preserve">bildet den formalen Abschluss der Prüfung.</w:t>
       </w:r>
       <w:ins w:id="11003" w:author="Claude" w:date="2026-10-25T13:35:03Z">
         <w:r>
-          <w:t xml:space="preserve"> Findet das Closing Meeting remote statt oder nimmt eine größere Runde teil, kann es bei Bedarf um wenige Tage nach hinten verschoben werden; die Verschiebung ist zu dokumentieren. Die Fristen beginnen mit dem tatsächlichen Tag des Closing Meetings.</w:t>
+          <w:t xml:space="preserve"> In begründeten Ausnahmefällen, insbesondere bei einem Remote-Closing-Meeting oder einer größeren Teilnehmerrunde, findet das Closing Meeting zeitnah nach dem letzten Prüfungstag statt, spätestens jedoch 7 Kalendertage danach; die Abweichung ist zu dokumentieren. Die Fristen beginnen mit dem tatsächlichen Tag des Closing Meetings.</w:t>
         </w:r>
       </w:ins>
       <w:r>

</xml_diff>

<commit_message>
Diagramme überarbeitet; Kapitel 3.3-3.5 (Abweichungen, LoE-Phasen, Schrittübersicht) und 5.4 (Abbruch und Verschiebung) ergänzt
Co-Authored-By: Claude Sonnet 5.5 <noreply@anthropic.com>
Claude-Session: https://claude.ai/code/session_01WyvNodyyJRof1fHMN8ju4o
</commit_message>
<xml_diff>
--- a/CADIS_Prozessbeschreibung_mit_Aenderungen.docx
+++ b/CADIS_Prozessbeschreibung_mit_Aenderungen.docx
@@ -3429,7 +3429,7 @@
         </w:rPr>
         <w:drawing>
           <wp:inline distT="0" distB="0" distL="0" distR="0" wp14:anchorId="44CAE299" wp14:editId="3663E073">
-            <wp:extent cx="5676900" cy="2620108"/>
+            <wp:extent cx="5676900" cy="3050970"/>
             <wp:effectExtent l="0" t="0" r="0" b="0"/>
             <wp:docPr id="30" name="Picture" descr="Abbildung 1: Prüfzyklus und Abfolge der Prüfarten"/>
             <wp:cNvGraphicFramePr/>
@@ -3451,7 +3451,7 @@
                   <pic:spPr bwMode="auto">
                     <a:xfrm>
                       <a:off x="0" y="0"/>
-                      <a:ext cx="5676900" cy="2620108"/>
+                      <a:ext cx="5676900" cy="3050970"/>
                     </a:xfrm>
                     <a:prstGeom prst="rect">
                       <a:avLst/>
@@ -3950,6 +3950,3024 @@
     </w:p>
     <w:p>
       <w:pPr>
+        <w:pStyle w:val="berschrift2"/>
+        <w:rPr>
+          <w:ins w:id="12001" w:author="Claude" w:date="2026-10-25T13:49:46Z"/>
+        </w:rPr>
+      </w:pPr>
+      <w:ins w:id="12002" w:author="Claude" w:date="2026-10-25T13:49:46Z">
+        <w:r>
+          <w:t xml:space="preserve">3.3 Abweichungen: Fristen und Folgen im Überblick</w:t>
+        </w:r>
+      </w:ins>
+    </w:p>
+    <w:p>
+      <w:pPr>
+        <w:pStyle w:val="Textkrper1"/>
+        <w:rPr>
+          <w:ins w:id="12003" w:author="Claude" w:date="2026-10-25T13:49:46Z"/>
+        </w:rPr>
+      </w:pPr>
+      <w:ins w:id="12004" w:author="Claude" w:date="2026-10-25T13:49:46Z">
+        <w:r>
+          <w:t xml:space="preserve">Die folgende Übersicht fasst zusammen, welche Frist für welche Abweichung gilt und welche Folgen eine Überschreitung hat. Alle Fristen beginnen mit dem Closing Meeting der zugrunde liegenden Prüfung (Kapitel 3.2). Maßgeblich sind die jeweiligen Schritte und das CADIS®-Handbuch (Kapitel 6.8, 7 und 8).</w:t>
+        </w:r>
+      </w:ins>
+    </w:p>
+    <w:tbl>
+      <w:tblPr>
+        <w:tblStyle w:val="Table"/>
+        <w:tblW w:w="5000" w:type="pct"/>
+        <w:tblLook w:val="0420" w:firstRow="1" w:lastRow="0" w:firstColumn="0" w:lastColumn="0" w:noHBand="0" w:noVBand="1"/>
+      </w:tblPr>
+      <w:tblGrid>
+        <w:gridCol w:w="2400"/>
+        <w:gridCol w:w="2150"/>
+        <w:gridCol w:w="2450"/>
+        <w:gridCol w:w="1948"/>
+      </w:tblGrid>
+      <w:tr>
+        <w:trPr>
+          <w:cnfStyle w:val="100000000000" w:firstRow="1" w:lastRow="0" w:firstColumn="0" w:lastColumn="0" w:oddVBand="0" w:evenVBand="0" w:oddHBand="0" w:evenHBand="0" w:firstRowFirstColumn="0" w:firstRowLastColumn="0" w:lastRowFirstColumn="0" w:lastRowLastColumn="0"/>
+          <w:cantSplit/>
+          <w:tblHeader/>
+          <w:ins w:id="12005" w:author="Claude" w:date="2026-10-25T13:49:46Z"/>
+        </w:trPr>
+        <w:tc>
+          <w:tcPr>
+            <w:tcW w:w="2400" w:type="dxa"/>
+          </w:tcPr>
+          <w:p>
+            <w:pPr>
+              <w:pStyle w:val="Compact"/>
+              <w:rPr>
+                <w:ins w:id="12006" w:author="Claude" w:date="2026-10-25T13:49:46Z"/>
+              </w:rPr>
+            </w:pPr>
+            <w:ins w:id="12007" w:author="Claude" w:date="2026-10-25T13:49:46Z">
+              <w:r>
+                <w:t xml:space="preserve">Abweichung</w:t>
+              </w:r>
+            </w:ins>
+          </w:p>
+        </w:tc>
+        <w:tc>
+          <w:tcPr>
+            <w:tcW w:w="2150" w:type="dxa"/>
+          </w:tcPr>
+          <w:p>
+            <w:pPr>
+              <w:pStyle w:val="Compact"/>
+              <w:rPr>
+                <w:ins w:id="12008" w:author="Claude" w:date="2026-10-25T13:49:46Z"/>
+              </w:rPr>
+            </w:pPr>
+            <w:ins w:id="12009" w:author="Claude" w:date="2026-10-25T13:49:46Z">
+              <w:r>
+                <w:t xml:space="preserve">Frist zur Schließung</w:t>
+              </w:r>
+            </w:ins>
+          </w:p>
+        </w:tc>
+        <w:tc>
+          <w:tcPr>
+            <w:tcW w:w="2450" w:type="dxa"/>
+          </w:tcPr>
+          <w:p>
+            <w:pPr>
+              <w:pStyle w:val="Compact"/>
+              <w:rPr>
+                <w:ins w:id="12010" w:author="Claude" w:date="2026-10-25T13:49:46Z"/>
+              </w:rPr>
+            </w:pPr>
+            <w:ins w:id="12011" w:author="Claude" w:date="2026-10-25T13:49:46Z">
+              <w:r>
+                <w:t xml:space="preserve">Folge bei Fristüberschreitung</w:t>
+              </w:r>
+            </w:ins>
+          </w:p>
+        </w:tc>
+        <w:tc>
+          <w:tcPr>
+            <w:tcW w:w="1948" w:type="dxa"/>
+          </w:tcPr>
+          <w:p>
+            <w:pPr>
+              <w:pStyle w:val="Compact"/>
+              <w:rPr>
+                <w:ins w:id="12012" w:author="Claude" w:date="2026-10-25T13:49:46Z"/>
+              </w:rPr>
+            </w:pPr>
+            <w:ins w:id="12013" w:author="Claude" w:date="2026-10-25T13:49:46Z">
+              <w:r>
+                <w:t xml:space="preserve">Freigabestatus</w:t>
+              </w:r>
+            </w:ins>
+          </w:p>
+        </w:tc>
+      </w:tr>
+      <w:tr>
+        <w:trPr>
+          <w:cantSplit/>
+          <w:ins w:id="12014" w:author="Claude" w:date="2026-10-25T13:49:46Z"/>
+        </w:trPr>
+        <w:tc>
+          <w:tcPr>
+            <w:tcW w:w="2400" w:type="dxa"/>
+          </w:tcPr>
+          <w:p>
+            <w:pPr>
+              <w:pStyle w:val="Compact"/>
+              <w:rPr>
+                <w:ins w:id="12015" w:author="Claude" w:date="2026-10-25T13:49:46Z"/>
+              </w:rPr>
+            </w:pPr>
+            <w:ins w:id="12016" w:author="Claude" w:date="2026-10-25T13:49:46Z">
+              <w:r>
+                <w:t xml:space="preserve">Kritisch – Erst- oder Erweiterungsprüfung</w:t>
+              </w:r>
+            </w:ins>
+          </w:p>
+        </w:tc>
+        <w:tc>
+          <w:tcPr>
+            <w:tcW w:w="2150" w:type="dxa"/>
+          </w:tcPr>
+          <w:p>
+            <w:pPr>
+              <w:pStyle w:val="Compact"/>
+              <w:rPr>
+                <w:ins w:id="12017" w:author="Claude" w:date="2026-10-25T13:49:46Z"/>
+              </w:rPr>
+            </w:pPr>
+            <w:ins w:id="12018" w:author="Claude" w:date="2026-10-25T13:49:46Z">
+              <w:r>
+                <w:t xml:space="preserve">3 Monate; schließen oder begründet herabstufen</w:t>
+              </w:r>
+            </w:ins>
+          </w:p>
+        </w:tc>
+        <w:tc>
+          <w:tcPr>
+            <w:tcW w:w="2450" w:type="dxa"/>
+          </w:tcPr>
+          <w:p>
+            <w:pPr>
+              <w:pStyle w:val="Compact"/>
+              <w:rPr>
+                <w:ins w:id="12019" w:author="Claude" w:date="2026-10-25T13:49:46Z"/>
+              </w:rPr>
+            </w:pPr>
+            <w:ins w:id="12020" w:author="Claude" w:date="2026-10-25T13:49:46Z">
+              <w:r>
+                <w:t xml:space="preserve">Prüfung ohne Freigabe; vollständige Neuprüfung</w:t>
+              </w:r>
+            </w:ins>
+          </w:p>
+        </w:tc>
+        <w:tc>
+          <w:tcPr>
+            <w:tcW w:w="1948" w:type="dxa"/>
+          </w:tcPr>
+          <w:p>
+            <w:pPr>
+              <w:pStyle w:val="Compact"/>
+              <w:rPr>
+                <w:ins w:id="12021" w:author="Claude" w:date="2026-10-25T13:49:46Z"/>
+              </w:rPr>
+            </w:pPr>
+            <w:ins w:id="12022" w:author="Claude" w:date="2026-10-25T13:49:46Z">
+              <w:r>
+                <w:t xml:space="preserve">Keine Freigabe bis zum erfolgreichen Follow-Up</w:t>
+              </w:r>
+            </w:ins>
+          </w:p>
+        </w:tc>
+      </w:tr>
+      <w:tr>
+        <w:trPr>
+          <w:cantSplit/>
+          <w:ins w:id="12023" w:author="Claude" w:date="2026-10-25T13:49:46Z"/>
+        </w:trPr>
+        <w:tc>
+          <w:tcPr>
+            <w:tcW w:w="2400" w:type="dxa"/>
+          </w:tcPr>
+          <w:p>
+            <w:pPr>
+              <w:pStyle w:val="Compact"/>
+              <w:rPr>
+                <w:ins w:id="12024" w:author="Claude" w:date="2026-10-25T13:49:46Z"/>
+              </w:rPr>
+            </w:pPr>
+            <w:ins w:id="12025" w:author="Claude" w:date="2026-10-25T13:49:46Z">
+              <w:r>
+                <w:t xml:space="preserve">Kritisch, begründet herabgestuft (Erst- oder Erweiterungsprüfung)</w:t>
+              </w:r>
+            </w:ins>
+          </w:p>
+        </w:tc>
+        <w:tc>
+          <w:tcPr>
+            <w:tcW w:w="2150" w:type="dxa"/>
+          </w:tcPr>
+          <w:p>
+            <w:pPr>
+              <w:pStyle w:val="Compact"/>
+              <w:rPr>
+                <w:ins w:id="12026" w:author="Claude" w:date="2026-10-25T13:49:46Z"/>
+              </w:rPr>
+            </w:pPr>
+            <w:ins w:id="12027" w:author="Claude" w:date="2026-10-25T13:49:46Z">
+              <w:r>
+                <w:t xml:space="preserve">gilt als nicht kritisch; bis zur Überwachungsprüfung</w:t>
+              </w:r>
+            </w:ins>
+          </w:p>
+        </w:tc>
+        <w:tc>
+          <w:tcPr>
+            <w:tcW w:w="2450" w:type="dxa"/>
+          </w:tcPr>
+          <w:p>
+            <w:pPr>
+              <w:pStyle w:val="Compact"/>
+              <w:rPr>
+                <w:ins w:id="12028" w:author="Claude" w:date="2026-10-25T13:49:46Z"/>
+              </w:rPr>
+            </w:pPr>
+            <w:ins w:id="12029" w:author="Claude" w:date="2026-10-25T13:49:46Z">
+              <w:r>
+                <w:t xml:space="preserve">Eskalation auf „kritisch abweichend“; Freigabe erlischt</w:t>
+              </w:r>
+            </w:ins>
+          </w:p>
+        </w:tc>
+        <w:tc>
+          <w:tcPr>
+            <w:tcW w:w="1948" w:type="dxa"/>
+          </w:tcPr>
+          <w:p>
+            <w:pPr>
+              <w:pStyle w:val="Compact"/>
+              <w:rPr>
+                <w:ins w:id="12030" w:author="Claude" w:date="2026-10-25T13:49:46Z"/>
+              </w:rPr>
+            </w:pPr>
+            <w:ins w:id="12031" w:author="Claude" w:date="2026-10-25T13:49:46Z">
+              <w:r>
+                <w:t xml:space="preserve">Temporäre Freigabe</w:t>
+              </w:r>
+            </w:ins>
+          </w:p>
+        </w:tc>
+      </w:tr>
+      <w:tr>
+        <w:trPr>
+          <w:cantSplit/>
+          <w:ins w:id="12032" w:author="Claude" w:date="2026-10-25T13:49:46Z"/>
+        </w:trPr>
+        <w:tc>
+          <w:tcPr>
+            <w:tcW w:w="2400" w:type="dxa"/>
+          </w:tcPr>
+          <w:p>
+            <w:pPr>
+              <w:pStyle w:val="Compact"/>
+              <w:rPr>
+                <w:ins w:id="12033" w:author="Claude" w:date="2026-10-25T13:49:46Z"/>
+              </w:rPr>
+            </w:pPr>
+            <w:ins w:id="12034" w:author="Claude" w:date="2026-10-25T13:49:46Z">
+              <w:r>
+                <w:t xml:space="preserve">Nicht kritisch – Erst- oder Erweiterungsprüfung</w:t>
+              </w:r>
+            </w:ins>
+          </w:p>
+        </w:tc>
+        <w:tc>
+          <w:tcPr>
+            <w:tcW w:w="2150" w:type="dxa"/>
+          </w:tcPr>
+          <w:p>
+            <w:pPr>
+              <w:pStyle w:val="Compact"/>
+              <w:rPr>
+                <w:ins w:id="12035" w:author="Claude" w:date="2026-10-25T13:49:46Z"/>
+              </w:rPr>
+            </w:pPr>
+            <w:ins w:id="12036" w:author="Claude" w:date="2026-10-25T13:49:46Z">
+              <w:r>
+                <w:t xml:space="preserve">bis zur risikobasierten Überwachungsprüfung</w:t>
+              </w:r>
+            </w:ins>
+          </w:p>
+        </w:tc>
+        <w:tc>
+          <w:tcPr>
+            <w:tcW w:w="2450" w:type="dxa"/>
+          </w:tcPr>
+          <w:p>
+            <w:pPr>
+              <w:pStyle w:val="Compact"/>
+              <w:rPr>
+                <w:ins w:id="12037" w:author="Claude" w:date="2026-10-25T13:49:46Z"/>
+              </w:rPr>
+            </w:pPr>
+            <w:ins w:id="12038" w:author="Claude" w:date="2026-10-25T13:49:46Z">
+              <w:r>
+                <w:t xml:space="preserve">Eskalation auf „kritisch abweichend“; Freigabe erlischt sofort; Fristen nach Schritt Ü-05 a)</w:t>
+              </w:r>
+            </w:ins>
+          </w:p>
+        </w:tc>
+        <w:tc>
+          <w:tcPr>
+            <w:tcW w:w="1948" w:type="dxa"/>
+          </w:tcPr>
+          <w:p>
+            <w:pPr>
+              <w:pStyle w:val="Compact"/>
+              <w:rPr>
+                <w:ins w:id="12039" w:author="Claude" w:date="2026-10-25T13:49:46Z"/>
+              </w:rPr>
+            </w:pPr>
+            <w:ins w:id="12040" w:author="Claude" w:date="2026-10-25T13:49:46Z">
+              <w:r>
+                <w:t xml:space="preserve">Temporäre Freigabe bei freigegebenem Maßnahmenplan</w:t>
+              </w:r>
+            </w:ins>
+          </w:p>
+        </w:tc>
+      </w:tr>
+      <w:tr>
+        <w:trPr>
+          <w:cantSplit/>
+          <w:ins w:id="12041" w:author="Claude" w:date="2026-10-25T13:49:46Z"/>
+        </w:trPr>
+        <w:tc>
+          <w:tcPr>
+            <w:tcW w:w="2400" w:type="dxa"/>
+          </w:tcPr>
+          <w:p>
+            <w:pPr>
+              <w:pStyle w:val="Compact"/>
+              <w:rPr>
+                <w:ins w:id="12042" w:author="Claude" w:date="2026-10-25T13:49:46Z"/>
+              </w:rPr>
+            </w:pPr>
+            <w:ins w:id="12043" w:author="Claude" w:date="2026-10-25T13:49:46Z">
+              <w:r>
+                <w:t xml:space="preserve">Kritisch – neu in der Überwachungsprüfung</w:t>
+              </w:r>
+            </w:ins>
+          </w:p>
+        </w:tc>
+        <w:tc>
+          <w:tcPr>
+            <w:tcW w:w="2150" w:type="dxa"/>
+          </w:tcPr>
+          <w:p>
+            <w:pPr>
+              <w:pStyle w:val="Compact"/>
+              <w:rPr>
+                <w:ins w:id="12044" w:author="Claude" w:date="2026-10-25T13:49:46Z"/>
+              </w:rPr>
+            </w:pPr>
+            <w:ins w:id="12045" w:author="Claude" w:date="2026-10-25T13:49:46Z">
+              <w:r>
+                <w:t xml:space="preserve">3 Monate; nach begründeter Herabstufung insgesamt 6 Monate</w:t>
+              </w:r>
+            </w:ins>
+          </w:p>
+        </w:tc>
+        <w:tc>
+          <w:tcPr>
+            <w:tcW w:w="2450" w:type="dxa"/>
+          </w:tcPr>
+          <w:p>
+            <w:pPr>
+              <w:pStyle w:val="Compact"/>
+              <w:rPr>
+                <w:ins w:id="12046" w:author="Claude" w:date="2026-10-25T13:49:46Z"/>
+              </w:rPr>
+            </w:pPr>
+            <w:ins w:id="12047" w:author="Claude" w:date="2026-10-25T13:49:46Z">
+              <w:r>
+                <w:t xml:space="preserve">Vollständige Neuprüfung</w:t>
+              </w:r>
+            </w:ins>
+          </w:p>
+        </w:tc>
+        <w:tc>
+          <w:tcPr>
+            <w:tcW w:w="1948" w:type="dxa"/>
+          </w:tcPr>
+          <w:p>
+            <w:pPr>
+              <w:pStyle w:val="Compact"/>
+              <w:rPr>
+                <w:ins w:id="12048" w:author="Claude" w:date="2026-10-25T13:49:46Z"/>
+              </w:rPr>
+            </w:pPr>
+            <w:ins w:id="12049" w:author="Claude" w:date="2026-10-25T13:49:46Z">
+              <w:r>
+                <w:t xml:space="preserve">Freigabe erlischt sofort</w:t>
+              </w:r>
+            </w:ins>
+          </w:p>
+        </w:tc>
+      </w:tr>
+      <w:tr>
+        <w:trPr>
+          <w:cantSplit/>
+          <w:ins w:id="12050" w:author="Claude" w:date="2026-10-25T13:49:46Z"/>
+        </w:trPr>
+        <w:tc>
+          <w:tcPr>
+            <w:tcW w:w="2400" w:type="dxa"/>
+          </w:tcPr>
+          <w:p>
+            <w:pPr>
+              <w:pStyle w:val="Compact"/>
+              <w:rPr>
+                <w:ins w:id="12051" w:author="Claude" w:date="2026-10-25T13:49:46Z"/>
+              </w:rPr>
+            </w:pPr>
+            <w:ins w:id="12052" w:author="Claude" w:date="2026-10-25T13:49:46Z">
+              <w:r>
+                <w:t xml:space="preserve">Nicht kritisch – neu in der Überwachungsprüfung</w:t>
+              </w:r>
+            </w:ins>
+          </w:p>
+        </w:tc>
+        <w:tc>
+          <w:tcPr>
+            <w:tcW w:w="2150" w:type="dxa"/>
+          </w:tcPr>
+          <w:p>
+            <w:pPr>
+              <w:pStyle w:val="Compact"/>
+              <w:rPr>
+                <w:ins w:id="12053" w:author="Claude" w:date="2026-10-25T13:49:46Z"/>
+              </w:rPr>
+            </w:pPr>
+            <w:ins w:id="12054" w:author="Claude" w:date="2026-10-25T13:49:46Z">
+              <w:r>
+                <w:t xml:space="preserve">3 Monate</w:t>
+              </w:r>
+            </w:ins>
+          </w:p>
+        </w:tc>
+        <w:tc>
+          <w:tcPr>
+            <w:tcW w:w="2450" w:type="dxa"/>
+          </w:tcPr>
+          <w:p>
+            <w:pPr>
+              <w:pStyle w:val="Compact"/>
+              <w:rPr>
+                <w:ins w:id="12055" w:author="Claude" w:date="2026-10-25T13:49:46Z"/>
+              </w:rPr>
+            </w:pPr>
+            <w:ins w:id="12056" w:author="Claude" w:date="2026-10-25T13:49:46Z">
+              <w:r>
+                <w:t xml:space="preserve">Vollständige Neuprüfung</w:t>
+              </w:r>
+            </w:ins>
+          </w:p>
+        </w:tc>
+        <w:tc>
+          <w:tcPr>
+            <w:tcW w:w="1948" w:type="dxa"/>
+          </w:tcPr>
+          <w:p>
+            <w:pPr>
+              <w:pStyle w:val="Compact"/>
+              <w:rPr>
+                <w:ins w:id="12057" w:author="Claude" w:date="2026-10-25T13:49:46Z"/>
+              </w:rPr>
+            </w:pPr>
+            <w:ins w:id="12058" w:author="Claude" w:date="2026-10-25T13:49:46Z">
+              <w:r>
+                <w:t xml:space="preserve">Bestehende Freigabe wird sofort zur temporären Freigabe</w:t>
+              </w:r>
+            </w:ins>
+          </w:p>
+        </w:tc>
+      </w:tr>
+      <w:tr>
+        <w:trPr>
+          <w:cantSplit/>
+          <w:ins w:id="12059" w:author="Claude" w:date="2026-10-25T13:49:46Z"/>
+        </w:trPr>
+        <w:tc>
+          <w:tcPr>
+            <w:tcW w:w="2400" w:type="dxa"/>
+          </w:tcPr>
+          <w:p>
+            <w:pPr>
+              <w:pStyle w:val="Compact"/>
+              <w:rPr>
+                <w:ins w:id="12060" w:author="Claude" w:date="2026-10-25T13:49:46Z"/>
+              </w:rPr>
+            </w:pPr>
+            <w:ins w:id="12061" w:author="Claude" w:date="2026-10-25T13:49:46Z">
+              <w:r>
+                <w:t xml:space="preserve">Nicht kritisch aus der Vorprüfung, in der Überwachungsprüfung nicht abgestellt</w:t>
+              </w:r>
+            </w:ins>
+          </w:p>
+        </w:tc>
+        <w:tc>
+          <w:tcPr>
+            <w:tcW w:w="2150" w:type="dxa"/>
+          </w:tcPr>
+          <w:p>
+            <w:pPr>
+              <w:pStyle w:val="Compact"/>
+              <w:rPr>
+                <w:ins w:id="12062" w:author="Claude" w:date="2026-10-25T13:49:46Z"/>
+              </w:rPr>
+            </w:pPr>
+            <w:ins w:id="12063" w:author="Claude" w:date="2026-10-25T13:49:46Z">
+              <w:r>
+                <w:t xml:space="preserve">–</w:t>
+              </w:r>
+            </w:ins>
+          </w:p>
+        </w:tc>
+        <w:tc>
+          <w:tcPr>
+            <w:tcW w:w="2450" w:type="dxa"/>
+          </w:tcPr>
+          <w:p>
+            <w:pPr>
+              <w:pStyle w:val="Compact"/>
+              <w:rPr>
+                <w:ins w:id="12064" w:author="Claude" w:date="2026-10-25T13:49:46Z"/>
+              </w:rPr>
+            </w:pPr>
+            <w:ins w:id="12065" w:author="Claude" w:date="2026-10-25T13:49:46Z">
+              <w:r>
+                <w:t xml:space="preserve">Wird kritisch; weiter wie „kritisch – neu in der Überwachungsprüfung“</w:t>
+              </w:r>
+            </w:ins>
+          </w:p>
+        </w:tc>
+        <w:tc>
+          <w:tcPr>
+            <w:tcW w:w="1948" w:type="dxa"/>
+          </w:tcPr>
+          <w:p>
+            <w:pPr>
+              <w:pStyle w:val="Compact"/>
+              <w:rPr>
+                <w:ins w:id="12066" w:author="Claude" w:date="2026-10-25T13:49:46Z"/>
+              </w:rPr>
+            </w:pPr>
+            <w:ins w:id="12067" w:author="Claude" w:date="2026-10-25T13:49:46Z">
+              <w:r>
+                <w:t xml:space="preserve">Freigabe erlischt sofort</w:t>
+              </w:r>
+            </w:ins>
+          </w:p>
+        </w:tc>
+      </w:tr>
+      <w:tr>
+        <w:trPr>
+          <w:cantSplit/>
+          <w:ins w:id="12068" w:author="Claude" w:date="2026-10-25T13:49:46Z"/>
+        </w:trPr>
+        <w:tc>
+          <w:tcPr>
+            <w:tcW w:w="2400" w:type="dxa"/>
+          </w:tcPr>
+          <w:p>
+            <w:pPr>
+              <w:pStyle w:val="Compact"/>
+              <w:rPr>
+                <w:ins w:id="12069" w:author="Claude" w:date="2026-10-25T13:49:46Z"/>
+              </w:rPr>
+            </w:pPr>
+            <w:ins w:id="12070" w:author="Claude" w:date="2026-10-25T13:49:46Z">
+              <w:r>
+                <w:t xml:space="preserve">Maßnahmenplan nicht eingereicht oder nicht freigegeben</w:t>
+              </w:r>
+            </w:ins>
+          </w:p>
+        </w:tc>
+        <w:tc>
+          <w:tcPr>
+            <w:tcW w:w="2150" w:type="dxa"/>
+          </w:tcPr>
+          <w:p>
+            <w:pPr>
+              <w:pStyle w:val="Compact"/>
+              <w:rPr>
+                <w:ins w:id="12071" w:author="Claude" w:date="2026-10-25T13:49:46Z"/>
+              </w:rPr>
+            </w:pPr>
+            <w:ins w:id="12072" w:author="Claude" w:date="2026-10-25T13:49:46Z">
+              <w:r>
+                <w:t xml:space="preserve">Einreichung: 2 Wochen; einmalige Nachbesserung: weitere 2 Wochen</w:t>
+              </w:r>
+            </w:ins>
+          </w:p>
+        </w:tc>
+        <w:tc>
+          <w:tcPr>
+            <w:tcW w:w="2450" w:type="dxa"/>
+          </w:tcPr>
+          <w:p>
+            <w:pPr>
+              <w:pStyle w:val="Compact"/>
+              <w:rPr>
+                <w:ins w:id="12073" w:author="Claude" w:date="2026-10-25T13:49:46Z"/>
+              </w:rPr>
+            </w:pPr>
+            <w:ins w:id="12074" w:author="Claude" w:date="2026-10-25T13:49:46Z">
+              <w:r>
+                <w:t xml:space="preserve">Prüfbericht ohne Maßnahmenplan (Schritt M-02)</w:t>
+              </w:r>
+            </w:ins>
+          </w:p>
+        </w:tc>
+        <w:tc>
+          <w:tcPr>
+            <w:tcW w:w="1948" w:type="dxa"/>
+          </w:tcPr>
+          <w:p>
+            <w:pPr>
+              <w:pStyle w:val="Compact"/>
+              <w:rPr>
+                <w:ins w:id="12075" w:author="Claude" w:date="2026-10-25T13:49:46Z"/>
+              </w:rPr>
+            </w:pPr>
+            <w:ins w:id="12076" w:author="Claude" w:date="2026-10-25T13:49:46Z">
+              <w:r>
+                <w:t xml:space="preserve">Weder Freigabe noch temporäre Freigabe</w:t>
+              </w:r>
+            </w:ins>
+          </w:p>
+        </w:tc>
+      </w:tr>
+    </w:tbl>
+    <w:p>
+      <w:pPr>
+        <w:pStyle w:val="Textkrper1"/>
+        <w:rPr>
+          <w:ins w:id="12077" w:author="Claude" w:date="2026-10-25T13:49:46Z"/>
+        </w:rPr>
+      </w:pPr>
+      <w:ins w:id="12078" w:author="Claude" w:date="2026-10-25T13:49:46Z"/>
+    </w:p>
+    <w:p>
+      <w:pPr>
+        <w:pStyle w:val="berschrift2"/>
+        <w:rPr>
+          <w:ins w:id="12079" w:author="Claude" w:date="2026-10-25T13:49:46Z"/>
+        </w:rPr>
+      </w:pPr>
+      <w:ins w:id="12080" w:author="Claude" w:date="2026-10-25T13:49:46Z">
+        <w:r>
+          <w:t xml:space="preserve">3.4 Phase 1 und Phase 2 je Level of Examination</w:t>
+        </w:r>
+      </w:ins>
+    </w:p>
+    <w:p>
+      <w:pPr>
+        <w:pStyle w:val="Textkrper1"/>
+        <w:rPr>
+          <w:ins w:id="12081" w:author="Claude" w:date="2026-10-25T13:49:46Z"/>
+        </w:rPr>
+      </w:pPr>
+      <w:ins w:id="12082" w:author="Claude" w:date="2026-10-25T13:49:46Z">
+        <w:r>
+          <w:t xml:space="preserve">Die Übersicht stellt die Inhalte der Phasen je Level of Examination gegenüber. Maßgeblich sind die Schritte 07 und 08 sowie das CADIS®-Handbuch (Kapitel 10).</w:t>
+        </w:r>
+      </w:ins>
+    </w:p>
+    <w:tbl>
+      <w:tblPr>
+        <w:tblStyle w:val="Table"/>
+        <w:tblW w:w="5000" w:type="pct"/>
+        <w:tblLook w:val="0420" w:firstRow="1" w:lastRow="0" w:firstColumn="0" w:lastColumn="0" w:noHBand="0" w:noVBand="1"/>
+      </w:tblPr>
+      <w:tblGrid>
+        <w:gridCol w:w="850"/>
+        <w:gridCol w:w="2400"/>
+        <w:gridCol w:w="3000"/>
+        <w:gridCol w:w="1200"/>
+        <w:gridCol w:w="1498"/>
+      </w:tblGrid>
+      <w:tr>
+        <w:trPr>
+          <w:cnfStyle w:val="100000000000" w:firstRow="1" w:lastRow="0" w:firstColumn="0" w:lastColumn="0" w:oddVBand="0" w:evenVBand="0" w:oddHBand="0" w:evenHBand="0" w:firstRowFirstColumn="0" w:firstRowLastColumn="0" w:lastRowFirstColumn="0" w:lastRowLastColumn="0"/>
+          <w:cantSplit/>
+          <w:tblHeader/>
+          <w:ins w:id="12083" w:author="Claude" w:date="2026-10-25T13:49:46Z"/>
+        </w:trPr>
+        <w:tc>
+          <w:tcPr>
+            <w:tcW w:w="850" w:type="dxa"/>
+          </w:tcPr>
+          <w:p>
+            <w:pPr>
+              <w:pStyle w:val="Compact"/>
+              <w:rPr>
+                <w:ins w:id="12084" w:author="Claude" w:date="2026-10-25T13:49:46Z"/>
+              </w:rPr>
+            </w:pPr>
+            <w:ins w:id="12085" w:author="Claude" w:date="2026-10-25T13:49:46Z">
+              <w:r>
+                <w:t xml:space="preserve">LoE</w:t>
+              </w:r>
+            </w:ins>
+          </w:p>
+        </w:tc>
+        <w:tc>
+          <w:tcPr>
+            <w:tcW w:w="2400" w:type="dxa"/>
+          </w:tcPr>
+          <w:p>
+            <w:pPr>
+              <w:pStyle w:val="Compact"/>
+              <w:rPr>
+                <w:ins w:id="12086" w:author="Claude" w:date="2026-10-25T13:49:46Z"/>
+              </w:rPr>
+            </w:pPr>
+            <w:ins w:id="12087" w:author="Claude" w:date="2026-10-25T13:49:46Z">
+              <w:r>
+                <w:t xml:space="preserve">Phase 1</w:t>
+              </w:r>
+            </w:ins>
+          </w:p>
+        </w:tc>
+        <w:tc>
+          <w:tcPr>
+            <w:tcW w:w="3000" w:type="dxa"/>
+          </w:tcPr>
+          <w:p>
+            <w:pPr>
+              <w:pStyle w:val="Compact"/>
+              <w:rPr>
+                <w:ins w:id="12088" w:author="Claude" w:date="2026-10-25T13:49:46Z"/>
+              </w:rPr>
+            </w:pPr>
+            <w:ins w:id="12089" w:author="Claude" w:date="2026-10-25T13:49:46Z">
+              <w:r>
+                <w:t xml:space="preserve">Phase 2</w:t>
+              </w:r>
+            </w:ins>
+          </w:p>
+        </w:tc>
+        <w:tc>
+          <w:tcPr>
+            <w:tcW w:w="1200" w:type="dxa"/>
+          </w:tcPr>
+          <w:p>
+            <w:pPr>
+              <w:pStyle w:val="Compact"/>
+              <w:rPr>
+                <w:ins w:id="12090" w:author="Claude" w:date="2026-10-25T13:49:46Z"/>
+              </w:rPr>
+            </w:pPr>
+            <w:ins w:id="12091" w:author="Claude" w:date="2026-10-25T13:49:46Z">
+              <w:r>
+                <w:t xml:space="preserve">Abstand</w:t>
+              </w:r>
+            </w:ins>
+          </w:p>
+        </w:tc>
+        <w:tc>
+          <w:tcPr>
+            <w:tcW w:w="1498" w:type="dxa"/>
+          </w:tcPr>
+          <w:p>
+            <w:pPr>
+              <w:pStyle w:val="Compact"/>
+              <w:rPr>
+                <w:ins w:id="12092" w:author="Claude" w:date="2026-10-25T13:49:46Z"/>
+              </w:rPr>
+            </w:pPr>
+            <w:ins w:id="12093" w:author="Claude" w:date="2026-10-25T13:49:46Z">
+              <w:r>
+                <w:t xml:space="preserve">Durchführung</w:t>
+              </w:r>
+            </w:ins>
+          </w:p>
+        </w:tc>
+      </w:tr>
+      <w:tr>
+        <w:trPr>
+          <w:cantSplit/>
+          <w:ins w:id="12094" w:author="Claude" w:date="2026-10-25T13:49:46Z"/>
+        </w:trPr>
+        <w:tc>
+          <w:tcPr>
+            <w:tcW w:w="850" w:type="dxa"/>
+          </w:tcPr>
+          <w:p>
+            <w:pPr>
+              <w:pStyle w:val="Compact"/>
+              <w:rPr>
+                <w:ins w:id="12095" w:author="Claude" w:date="2026-10-25T13:49:46Z"/>
+              </w:rPr>
+            </w:pPr>
+            <w:ins w:id="12096" w:author="Claude" w:date="2026-10-25T13:49:46Z">
+              <w:r>
+                <w:t xml:space="preserve">LoE 1</w:t>
+              </w:r>
+            </w:ins>
+          </w:p>
+        </w:tc>
+        <w:tc>
+          <w:tcPr>
+            <w:tcW w:w="2400" w:type="dxa"/>
+          </w:tcPr>
+          <w:p>
+            <w:pPr>
+              <w:pStyle w:val="Compact"/>
+              <w:rPr>
+                <w:ins w:id="12097" w:author="Claude" w:date="2026-10-25T13:49:46Z"/>
+              </w:rPr>
+            </w:pPr>
+            <w:ins w:id="12098" w:author="Claude" w:date="2026-10-25T13:49:46Z">
+              <w:r>
+                <w:t xml:space="preserve">Pre-Check: formale Vorabkontrolle je Prüffrage (Reifegrad, Umsetzungsbeschreibung, Nachweis)</w:t>
+              </w:r>
+            </w:ins>
+          </w:p>
+        </w:tc>
+        <w:tc>
+          <w:tcPr>
+            <w:tcW w:w="3000" w:type="dxa"/>
+          </w:tcPr>
+          <w:p>
+            <w:pPr>
+              <w:pStyle w:val="Compact"/>
+              <w:rPr>
+                <w:ins w:id="12099" w:author="Claude" w:date="2026-10-25T13:49:46Z"/>
+              </w:rPr>
+            </w:pPr>
+            <w:ins w:id="12100" w:author="Claude" w:date="2026-10-25T13:49:46Z">
+              <w:r>
+                <w:t xml:space="preserve">Plausibilitätsprüfung: Gesamtumsetzung je Prüfpunkt; Abgleich Reifegrad und Beschreibung, Konsistenz über Prüfpunkte, Eignung der Nachweisdokumenttypen</w:t>
+              </w:r>
+            </w:ins>
+          </w:p>
+        </w:tc>
+        <w:tc>
+          <w:tcPr>
+            <w:tcW w:w="1200" w:type="dxa"/>
+          </w:tcPr>
+          <w:p>
+            <w:pPr>
+              <w:pStyle w:val="Compact"/>
+              <w:rPr>
+                <w:ins w:id="12101" w:author="Claude" w:date="2026-10-25T13:49:46Z"/>
+              </w:rPr>
+            </w:pPr>
+            <w:ins w:id="12102" w:author="Claude" w:date="2026-10-25T13:49:46Z">
+              <w:r>
+                <w:t xml:space="preserve">2 bis 7 Tage</w:t>
+              </w:r>
+            </w:ins>
+          </w:p>
+        </w:tc>
+        <w:tc>
+          <w:tcPr>
+            <w:tcW w:w="1498" w:type="dxa"/>
+          </w:tcPr>
+          <w:p>
+            <w:pPr>
+              <w:pStyle w:val="Compact"/>
+              <w:rPr>
+                <w:ins w:id="12103" w:author="Claude" w:date="2026-10-25T13:49:46Z"/>
+              </w:rPr>
+            </w:pPr>
+            <w:ins w:id="12104" w:author="Claude" w:date="2026-10-25T13:49:46Z">
+              <w:r>
+                <w:t xml:space="preserve">Remote / aktenbasiert</w:t>
+              </w:r>
+            </w:ins>
+          </w:p>
+        </w:tc>
+      </w:tr>
+      <w:tr>
+        <w:trPr>
+          <w:cantSplit/>
+          <w:ins w:id="12105" w:author="Claude" w:date="2026-10-25T13:49:46Z"/>
+        </w:trPr>
+        <w:tc>
+          <w:tcPr>
+            <w:tcW w:w="850" w:type="dxa"/>
+          </w:tcPr>
+          <w:p>
+            <w:pPr>
+              <w:pStyle w:val="Compact"/>
+              <w:rPr>
+                <w:ins w:id="12106" w:author="Claude" w:date="2026-10-25T13:49:46Z"/>
+              </w:rPr>
+            </w:pPr>
+            <w:ins w:id="12107" w:author="Claude" w:date="2026-10-25T13:49:46Z">
+              <w:r>
+                <w:t xml:space="preserve">LoE 2</w:t>
+              </w:r>
+            </w:ins>
+          </w:p>
+        </w:tc>
+        <w:tc>
+          <w:tcPr>
+            <w:tcW w:w="2400" w:type="dxa"/>
+          </w:tcPr>
+          <w:p>
+            <w:pPr>
+              <w:pStyle w:val="Compact"/>
+              <w:rPr>
+                <w:ins w:id="12108" w:author="Claude" w:date="2026-10-25T13:49:46Z"/>
+              </w:rPr>
+            </w:pPr>
+            <w:ins w:id="12109" w:author="Claude" w:date="2026-10-25T13:49:46Z">
+              <w:r>
+                <w:t xml:space="preserve">Documentation Review: Vollständigkeit, Angemessenheit, Konsistenz</w:t>
+              </w:r>
+            </w:ins>
+          </w:p>
+        </w:tc>
+        <w:tc>
+          <w:tcPr>
+            <w:tcW w:w="3000" w:type="dxa"/>
+          </w:tcPr>
+          <w:p>
+            <w:pPr>
+              <w:pStyle w:val="Compact"/>
+              <w:rPr>
+                <w:ins w:id="12110" w:author="Claude" w:date="2026-10-25T13:49:46Z"/>
+              </w:rPr>
+            </w:pPr>
+            <w:ins w:id="12111" w:author="Claude" w:date="2026-10-25T13:49:46Z">
+              <w:r>
+                <w:t xml:space="preserve">Remote-Interview zu ausgewählten Prüfpunkten: ausgewogene, risikobasierte Mischung aus allen Prüfmodulen; Prüffragen werden vor Phase 2 mitgeteilt; Auditzeit nach Auditvertrag</w:t>
+              </w:r>
+            </w:ins>
+          </w:p>
+        </w:tc>
+        <w:tc>
+          <w:tcPr>
+            <w:tcW w:w="1200" w:type="dxa"/>
+          </w:tcPr>
+          <w:p>
+            <w:pPr>
+              <w:pStyle w:val="Compact"/>
+              <w:rPr>
+                <w:ins w:id="12112" w:author="Claude" w:date="2026-10-25T13:49:46Z"/>
+              </w:rPr>
+            </w:pPr>
+            <w:ins w:id="12113" w:author="Claude" w:date="2026-10-25T13:49:46Z">
+              <w:r>
+                <w:t xml:space="preserve">2 bis 7 Tage</w:t>
+              </w:r>
+            </w:ins>
+          </w:p>
+        </w:tc>
+        <w:tc>
+          <w:tcPr>
+            <w:tcW w:w="1498" w:type="dxa"/>
+          </w:tcPr>
+          <w:p>
+            <w:pPr>
+              <w:pStyle w:val="Compact"/>
+              <w:rPr>
+                <w:ins w:id="12114" w:author="Claude" w:date="2026-10-25T13:49:46Z"/>
+              </w:rPr>
+            </w:pPr>
+            <w:ins w:id="12115" w:author="Claude" w:date="2026-10-25T13:49:46Z">
+              <w:r>
+                <w:t xml:space="preserve">Remote</w:t>
+              </w:r>
+            </w:ins>
+          </w:p>
+        </w:tc>
+      </w:tr>
+      <w:tr>
+        <w:trPr>
+          <w:cantSplit/>
+          <w:ins w:id="12116" w:author="Claude" w:date="2026-10-25T13:49:46Z"/>
+        </w:trPr>
+        <w:tc>
+          <w:tcPr>
+            <w:tcW w:w="850" w:type="dxa"/>
+          </w:tcPr>
+          <w:p>
+            <w:pPr>
+              <w:pStyle w:val="Compact"/>
+              <w:rPr>
+                <w:ins w:id="12117" w:author="Claude" w:date="2026-10-25T13:49:46Z"/>
+              </w:rPr>
+            </w:pPr>
+            <w:ins w:id="12118" w:author="Claude" w:date="2026-10-25T13:49:46Z">
+              <w:r>
+                <w:t xml:space="preserve">LoE 3</w:t>
+              </w:r>
+            </w:ins>
+          </w:p>
+        </w:tc>
+        <w:tc>
+          <w:tcPr>
+            <w:tcW w:w="2400" w:type="dxa"/>
+          </w:tcPr>
+          <w:p>
+            <w:pPr>
+              <w:pStyle w:val="Compact"/>
+              <w:rPr>
+                <w:ins w:id="12119" w:author="Claude" w:date="2026-10-25T13:49:46Z"/>
+              </w:rPr>
+            </w:pPr>
+            <w:ins w:id="12120" w:author="Claude" w:date="2026-10-25T13:49:46Z">
+              <w:r>
+                <w:t xml:space="preserve">Documentation Review und Vorbereitung der Vor-Ort-Prüfung (Interviewplan, Stichprobenumfang, Begehungsbereiche)</w:t>
+              </w:r>
+            </w:ins>
+          </w:p>
+        </w:tc>
+        <w:tc>
+          <w:tcPr>
+            <w:tcW w:w="3000" w:type="dxa"/>
+          </w:tcPr>
+          <w:p>
+            <w:pPr>
+              <w:pStyle w:val="Compact"/>
+              <w:rPr>
+                <w:ins w:id="12121" w:author="Claude" w:date="2026-10-25T13:49:46Z"/>
+              </w:rPr>
+            </w:pPr>
+            <w:ins w:id="12122" w:author="Claude" w:date="2026-10-25T13:49:46Z">
+              <w:r>
+                <w:t xml:space="preserve">Vor-Ort-Audit: Interviews, Einsichtnahmen und Stichproben, Begehungen</w:t>
+              </w:r>
+            </w:ins>
+          </w:p>
+        </w:tc>
+        <w:tc>
+          <w:tcPr>
+            <w:tcW w:w="1200" w:type="dxa"/>
+          </w:tcPr>
+          <w:p>
+            <w:pPr>
+              <w:pStyle w:val="Compact"/>
+              <w:rPr>
+                <w:ins w:id="12123" w:author="Claude" w:date="2026-10-25T13:49:46Z"/>
+              </w:rPr>
+            </w:pPr>
+            <w:ins w:id="12124" w:author="Claude" w:date="2026-10-25T13:49:46Z">
+              <w:r>
+                <w:t xml:space="preserve">7 bis 21 Tage</w:t>
+              </w:r>
+            </w:ins>
+          </w:p>
+        </w:tc>
+        <w:tc>
+          <w:tcPr>
+            <w:tcW w:w="1498" w:type="dxa"/>
+          </w:tcPr>
+          <w:p>
+            <w:pPr>
+              <w:pStyle w:val="Compact"/>
+              <w:rPr>
+                <w:ins w:id="12125" w:author="Claude" w:date="2026-10-25T13:49:46Z"/>
+              </w:rPr>
+            </w:pPr>
+            <w:ins w:id="12126" w:author="Claude" w:date="2026-10-25T13:49:46Z">
+              <w:r>
+                <w:t xml:space="preserve">Vor Ort</w:t>
+              </w:r>
+            </w:ins>
+          </w:p>
+        </w:tc>
+      </w:tr>
+    </w:tbl>
+    <w:p>
+      <w:pPr>
+        <w:pStyle w:val="Textkrper1"/>
+        <w:rPr>
+          <w:ins w:id="12127" w:author="Claude" w:date="2026-10-25T13:49:46Z"/>
+        </w:rPr>
+      </w:pPr>
+      <w:ins w:id="12128" w:author="Claude" w:date="2026-10-25T13:49:46Z"/>
+    </w:p>
+    <w:p>
+      <w:pPr>
+        <w:pStyle w:val="berschrift2"/>
+        <w:rPr>
+          <w:ins w:id="12129" w:author="Claude" w:date="2026-10-25T13:49:46Z"/>
+        </w:rPr>
+      </w:pPr>
+      <w:ins w:id="12130" w:author="Claude" w:date="2026-10-25T13:49:46Z">
+        <w:r>
+          <w:t xml:space="preserve">3.5 Übersicht der Prozessschritte</w:t>
+        </w:r>
+      </w:ins>
+    </w:p>
+    <w:p>
+      <w:pPr>
+        <w:pStyle w:val="Textkrper1"/>
+        <w:rPr>
+          <w:ins w:id="12131" w:author="Claude" w:date="2026-10-25T13:49:46Z"/>
+        </w:rPr>
+      </w:pPr>
+      <w:ins w:id="12132" w:author="Claude" w:date="2026-10-25T13:49:46Z">
+        <w:r>
+          <w:t xml:space="preserve">Die Tabelle listet alle Prozessschritte der Kapitel 4 und 5 mit Verantwortlichkeit und Ergebnis. Sie dient dem schnellen Nachschlagen; die Beschreibung der Schritte steht in den jeweiligen Kapiteln.</w:t>
+        </w:r>
+      </w:ins>
+    </w:p>
+    <w:tbl>
+      <w:tblPr>
+        <w:tblStyle w:val="Table"/>
+        <w:tblW w:w="5000" w:type="pct"/>
+        <w:tblLook w:val="0420" w:firstRow="1" w:lastRow="0" w:firstColumn="0" w:lastColumn="0" w:noHBand="0" w:noVBand="1"/>
+      </w:tblPr>
+      <w:tblGrid>
+        <w:gridCol w:w="3300"/>
+        <w:gridCol w:w="2650"/>
+        <w:gridCol w:w="2998"/>
+      </w:tblGrid>
+      <w:tr>
+        <w:trPr>
+          <w:cnfStyle w:val="100000000000" w:firstRow="1" w:lastRow="0" w:firstColumn="0" w:lastColumn="0" w:oddVBand="0" w:evenVBand="0" w:oddHBand="0" w:evenHBand="0" w:firstRowFirstColumn="0" w:firstRowLastColumn="0" w:lastRowFirstColumn="0" w:lastRowLastColumn="0"/>
+          <w:cantSplit/>
+          <w:tblHeader/>
+          <w:ins w:id="12133" w:author="Claude" w:date="2026-10-25T13:49:46Z"/>
+        </w:trPr>
+        <w:tc>
+          <w:tcPr>
+            <w:tcW w:w="3300" w:type="dxa"/>
+          </w:tcPr>
+          <w:p>
+            <w:pPr>
+              <w:pStyle w:val="Compact"/>
+              <w:rPr>
+                <w:ins w:id="12134" w:author="Claude" w:date="2026-10-25T13:49:46Z"/>
+              </w:rPr>
+            </w:pPr>
+            <w:ins w:id="12135" w:author="Claude" w:date="2026-10-25T13:49:46Z">
+              <w:r>
+                <w:t xml:space="preserve">Schritt</w:t>
+              </w:r>
+            </w:ins>
+          </w:p>
+        </w:tc>
+        <w:tc>
+          <w:tcPr>
+            <w:tcW w:w="2650" w:type="dxa"/>
+          </w:tcPr>
+          <w:p>
+            <w:pPr>
+              <w:pStyle w:val="Compact"/>
+              <w:rPr>
+                <w:ins w:id="12136" w:author="Claude" w:date="2026-10-25T13:49:46Z"/>
+              </w:rPr>
+            </w:pPr>
+            <w:ins w:id="12137" w:author="Claude" w:date="2026-10-25T13:49:46Z">
+              <w:r>
+                <w:t xml:space="preserve">Verantwortlich</w:t>
+              </w:r>
+            </w:ins>
+          </w:p>
+        </w:tc>
+        <w:tc>
+          <w:tcPr>
+            <w:tcW w:w="2998" w:type="dxa"/>
+          </w:tcPr>
+          <w:p>
+            <w:pPr>
+              <w:pStyle w:val="Compact"/>
+              <w:rPr>
+                <w:ins w:id="12138" w:author="Claude" w:date="2026-10-25T13:49:46Z"/>
+              </w:rPr>
+            </w:pPr>
+            <w:ins w:id="12139" w:author="Claude" w:date="2026-10-25T13:49:46Z">
+              <w:r>
+                <w:t xml:space="preserve">Ergebnis</w:t>
+              </w:r>
+            </w:ins>
+          </w:p>
+        </w:tc>
+      </w:tr>
+      <w:tr>
+        <w:trPr>
+          <w:cantSplit/>
+          <w:ins w:id="12140" w:author="Claude" w:date="2026-10-25T13:49:46Z"/>
+        </w:trPr>
+        <w:tc>
+          <w:tcPr>
+            <w:tcW w:w="3300" w:type="dxa"/>
+          </w:tcPr>
+          <w:p>
+            <w:pPr>
+              <w:pStyle w:val="Compact"/>
+              <w:rPr>
+                <w:ins w:id="12141" w:author="Claude" w:date="2026-10-25T13:49:46Z"/>
+              </w:rPr>
+            </w:pPr>
+            <w:ins w:id="12142" w:author="Claude" w:date="2026-10-25T13:49:46Z">
+              <w:r>
+                <w:t xml:space="preserve">01  Supplier Criticality Evaluation und Scope-Entwurf</w:t>
+              </w:r>
+            </w:ins>
+          </w:p>
+        </w:tc>
+        <w:tc>
+          <w:tcPr>
+            <w:tcW w:w="2650" w:type="dxa"/>
+          </w:tcPr>
+          <w:p>
+            <w:pPr>
+              <w:pStyle w:val="Compact"/>
+              <w:rPr>
+                <w:ins w:id="12143" w:author="Claude" w:date="2026-10-25T13:49:46Z"/>
+              </w:rPr>
+            </w:pPr>
+            <w:ins w:id="12144" w:author="Claude" w:date="2026-10-25T13:49:46Z">
+              <w:r>
+                <w:t xml:space="preserve">Hersteller/Auftraggeber</w:t>
+              </w:r>
+            </w:ins>
+          </w:p>
+        </w:tc>
+        <w:tc>
+          <w:tcPr>
+            <w:tcW w:w="2998" w:type="dxa"/>
+          </w:tcPr>
+          <w:p>
+            <w:pPr>
+              <w:pStyle w:val="Compact"/>
+              <w:rPr>
+                <w:ins w:id="12145" w:author="Claude" w:date="2026-10-25T13:49:46Z"/>
+              </w:rPr>
+            </w:pPr>
+            <w:ins w:id="12146" w:author="Claude" w:date="2026-10-25T13:49:46Z">
+              <w:r>
+                <w:t xml:space="preserve">SCE-Ergebnis, Scope-Entwurf</w:t>
+              </w:r>
+            </w:ins>
+          </w:p>
+        </w:tc>
+      </w:tr>
+      <w:tr>
+        <w:trPr>
+          <w:cantSplit/>
+          <w:ins w:id="12147" w:author="Claude" w:date="2026-10-25T13:49:46Z"/>
+        </w:trPr>
+        <w:tc>
+          <w:tcPr>
+            <w:tcW w:w="3300" w:type="dxa"/>
+          </w:tcPr>
+          <w:p>
+            <w:pPr>
+              <w:pStyle w:val="Compact"/>
+              <w:rPr>
+                <w:ins w:id="12148" w:author="Claude" w:date="2026-10-25T13:49:46Z"/>
+              </w:rPr>
+            </w:pPr>
+            <w:ins w:id="12149" w:author="Claude" w:date="2026-10-25T13:49:46Z">
+              <w:r>
+                <w:t xml:space="preserve">02  Beauftragung und Auditorzuweisung</w:t>
+              </w:r>
+            </w:ins>
+          </w:p>
+        </w:tc>
+        <w:tc>
+          <w:tcPr>
+            <w:tcW w:w="2650" w:type="dxa"/>
+          </w:tcPr>
+          <w:p>
+            <w:pPr>
+              <w:pStyle w:val="Compact"/>
+              <w:rPr>
+                <w:ins w:id="12150" w:author="Claude" w:date="2026-10-25T13:49:46Z"/>
+              </w:rPr>
+            </w:pPr>
+            <w:ins w:id="12151" w:author="Claude" w:date="2026-10-25T13:49:46Z">
+              <w:r>
+                <w:t xml:space="preserve">CADIS®-Fachbereich</w:t>
+              </w:r>
+            </w:ins>
+          </w:p>
+        </w:tc>
+        <w:tc>
+          <w:tcPr>
+            <w:tcW w:w="2998" w:type="dxa"/>
+          </w:tcPr>
+          <w:p>
+            <w:pPr>
+              <w:pStyle w:val="Compact"/>
+              <w:rPr>
+                <w:ins w:id="12152" w:author="Claude" w:date="2026-10-25T13:49:46Z"/>
+              </w:rPr>
+            </w:pPr>
+            <w:ins w:id="12153" w:author="Claude" w:date="2026-10-25T13:49:46Z">
+              <w:r>
+                <w:t xml:space="preserve">Auftragsbestätigung, Auditorzuweisung, Terminrahmen</w:t>
+              </w:r>
+            </w:ins>
+          </w:p>
+        </w:tc>
+      </w:tr>
+      <w:tr>
+        <w:trPr>
+          <w:cantSplit/>
+          <w:ins w:id="12154" w:author="Claude" w:date="2026-10-25T13:49:46Z"/>
+        </w:trPr>
+        <w:tc>
+          <w:tcPr>
+            <w:tcW w:w="3300" w:type="dxa"/>
+          </w:tcPr>
+          <w:p>
+            <w:pPr>
+              <w:pStyle w:val="Compact"/>
+              <w:rPr>
+                <w:ins w:id="12155" w:author="Claude" w:date="2026-10-25T13:49:46Z"/>
+              </w:rPr>
+            </w:pPr>
+            <w:ins w:id="12156" w:author="Claude" w:date="2026-10-25T13:49:46Z">
+              <w:r>
+                <w:t xml:space="preserve">03  Prüfung auf Interessenkonflikte</w:t>
+              </w:r>
+            </w:ins>
+          </w:p>
+        </w:tc>
+        <w:tc>
+          <w:tcPr>
+            <w:tcW w:w="2650" w:type="dxa"/>
+          </w:tcPr>
+          <w:p>
+            <w:pPr>
+              <w:pStyle w:val="Compact"/>
+              <w:rPr>
+                <w:ins w:id="12157" w:author="Claude" w:date="2026-10-25T13:49:46Z"/>
+              </w:rPr>
+            </w:pPr>
+            <w:ins w:id="12158" w:author="Claude" w:date="2026-10-25T13:49:46Z">
+              <w:r>
+                <w:t xml:space="preserve">Auditor</w:t>
+              </w:r>
+            </w:ins>
+          </w:p>
+        </w:tc>
+        <w:tc>
+          <w:tcPr>
+            <w:tcW w:w="2998" w:type="dxa"/>
+          </w:tcPr>
+          <w:p>
+            <w:pPr>
+              <w:pStyle w:val="Compact"/>
+              <w:rPr>
+                <w:ins w:id="12159" w:author="Claude" w:date="2026-10-25T13:49:46Z"/>
+              </w:rPr>
+            </w:pPr>
+            <w:ins w:id="12160" w:author="Claude" w:date="2026-10-25T13:49:46Z">
+              <w:r>
+                <w:t xml:space="preserve">dokumentierte Unparteilichkeitserklärung</w:t>
+              </w:r>
+            </w:ins>
+          </w:p>
+        </w:tc>
+      </w:tr>
+      <w:tr>
+        <w:trPr>
+          <w:cantSplit/>
+          <w:ins w:id="12161" w:author="Claude" w:date="2026-10-25T13:49:46Z"/>
+        </w:trPr>
+        <w:tc>
+          <w:tcPr>
+            <w:tcW w:w="3300" w:type="dxa"/>
+          </w:tcPr>
+          <w:p>
+            <w:pPr>
+              <w:pStyle w:val="Compact"/>
+              <w:rPr>
+                <w:ins w:id="12162" w:author="Claude" w:date="2026-10-25T13:49:46Z"/>
+              </w:rPr>
+            </w:pPr>
+            <w:ins w:id="12163" w:author="Claude" w:date="2026-10-25T13:49:46Z">
+              <w:r>
+                <w:t xml:space="preserve">04  Kick-Off und Scope-Bestätigung</w:t>
+              </w:r>
+            </w:ins>
+          </w:p>
+        </w:tc>
+        <w:tc>
+          <w:tcPr>
+            <w:tcW w:w="2650" w:type="dxa"/>
+          </w:tcPr>
+          <w:p>
+            <w:pPr>
+              <w:pStyle w:val="Compact"/>
+              <w:rPr>
+                <w:ins w:id="12164" w:author="Claude" w:date="2026-10-25T13:49:46Z"/>
+              </w:rPr>
+            </w:pPr>
+            <w:ins w:id="12165" w:author="Claude" w:date="2026-10-25T13:49:46Z">
+              <w:r>
+                <w:t xml:space="preserve">Auditor (Mitwirkung: geprüftes Unternehmen)</w:t>
+              </w:r>
+            </w:ins>
+          </w:p>
+        </w:tc>
+        <w:tc>
+          <w:tcPr>
+            <w:tcW w:w="2998" w:type="dxa"/>
+          </w:tcPr>
+          <w:p>
+            <w:pPr>
+              <w:pStyle w:val="Compact"/>
+              <w:rPr>
+                <w:ins w:id="12166" w:author="Claude" w:date="2026-10-25T13:49:46Z"/>
+              </w:rPr>
+            </w:pPr>
+            <w:ins w:id="12167" w:author="Claude" w:date="2026-10-25T13:49:46Z">
+              <w:r>
+                <w:t xml:space="preserve">Kick-Off-Protokoll, bestätigter Prüfscope</w:t>
+              </w:r>
+            </w:ins>
+          </w:p>
+        </w:tc>
+      </w:tr>
+      <w:tr>
+        <w:trPr>
+          <w:cantSplit/>
+          <w:ins w:id="12168" w:author="Claude" w:date="2026-10-25T13:49:46Z"/>
+        </w:trPr>
+        <w:tc>
+          <w:tcPr>
+            <w:tcW w:w="3300" w:type="dxa"/>
+          </w:tcPr>
+          <w:p>
+            <w:pPr>
+              <w:pStyle w:val="Compact"/>
+              <w:rPr>
+                <w:ins w:id="12169" w:author="Claude" w:date="2026-10-25T13:49:46Z"/>
+              </w:rPr>
+            </w:pPr>
+            <w:ins w:id="12170" w:author="Claude" w:date="2026-10-25T13:49:46Z">
+              <w:r>
+                <w:t xml:space="preserve">05  Prüfagenda anpassen und bestätigen</w:t>
+              </w:r>
+            </w:ins>
+          </w:p>
+        </w:tc>
+        <w:tc>
+          <w:tcPr>
+            <w:tcW w:w="2650" w:type="dxa"/>
+          </w:tcPr>
+          <w:p>
+            <w:pPr>
+              <w:pStyle w:val="Compact"/>
+              <w:rPr>
+                <w:ins w:id="12171" w:author="Claude" w:date="2026-10-25T13:49:46Z"/>
+              </w:rPr>
+            </w:pPr>
+            <w:ins w:id="12172" w:author="Claude" w:date="2026-10-25T13:49:46Z">
+              <w:r>
+                <w:t xml:space="preserve">Auditor</w:t>
+              </w:r>
+            </w:ins>
+          </w:p>
+        </w:tc>
+        <w:tc>
+          <w:tcPr>
+            <w:tcW w:w="2998" w:type="dxa"/>
+          </w:tcPr>
+          <w:p>
+            <w:pPr>
+              <w:pStyle w:val="Compact"/>
+              <w:rPr>
+                <w:ins w:id="12173" w:author="Claude" w:date="2026-10-25T13:49:46Z"/>
+              </w:rPr>
+            </w:pPr>
+            <w:ins w:id="12174" w:author="Claude" w:date="2026-10-25T13:49:46Z">
+              <w:r>
+                <w:t xml:space="preserve">abgestimmte Prüfagenda, Auditzeitberechnung</w:t>
+              </w:r>
+            </w:ins>
+          </w:p>
+        </w:tc>
+      </w:tr>
+      <w:tr>
+        <w:trPr>
+          <w:cantSplit/>
+          <w:ins w:id="12175" w:author="Claude" w:date="2026-10-25T13:49:46Z"/>
+        </w:trPr>
+        <w:tc>
+          <w:tcPr>
+            <w:tcW w:w="3300" w:type="dxa"/>
+          </w:tcPr>
+          <w:p>
+            <w:pPr>
+              <w:pStyle w:val="Compact"/>
+              <w:rPr>
+                <w:ins w:id="12176" w:author="Claude" w:date="2026-10-25T13:49:46Z"/>
+              </w:rPr>
+            </w:pPr>
+            <w:ins w:id="12177" w:author="Claude" w:date="2026-10-25T13:49:46Z">
+              <w:r>
+                <w:t xml:space="preserve">06  Prüfkatalog und Nachweise einreichen</w:t>
+              </w:r>
+            </w:ins>
+          </w:p>
+        </w:tc>
+        <w:tc>
+          <w:tcPr>
+            <w:tcW w:w="2650" w:type="dxa"/>
+          </w:tcPr>
+          <w:p>
+            <w:pPr>
+              <w:pStyle w:val="Compact"/>
+              <w:rPr>
+                <w:ins w:id="12178" w:author="Claude" w:date="2026-10-25T13:49:46Z"/>
+              </w:rPr>
+            </w:pPr>
+            <w:ins w:id="12179" w:author="Claude" w:date="2026-10-25T13:49:46Z">
+              <w:r>
+                <w:t xml:space="preserve">geprüftes Unternehmen</w:t>
+              </w:r>
+            </w:ins>
+          </w:p>
+        </w:tc>
+        <w:tc>
+          <w:tcPr>
+            <w:tcW w:w="2998" w:type="dxa"/>
+          </w:tcPr>
+          <w:p>
+            <w:pPr>
+              <w:pStyle w:val="Compact"/>
+              <w:rPr>
+                <w:ins w:id="12180" w:author="Claude" w:date="2026-10-25T13:49:46Z"/>
+              </w:rPr>
+            </w:pPr>
+            <w:ins w:id="12181" w:author="Claude" w:date="2026-10-25T13:49:46Z">
+              <w:r>
+                <w:t xml:space="preserve">ausgefüllter Prüfkatalog, Nachweisablage</w:t>
+              </w:r>
+            </w:ins>
+          </w:p>
+        </w:tc>
+      </w:tr>
+      <w:tr>
+        <w:trPr>
+          <w:cantSplit/>
+          <w:ins w:id="12182" w:author="Claude" w:date="2026-10-25T13:49:46Z"/>
+        </w:trPr>
+        <w:tc>
+          <w:tcPr>
+            <w:tcW w:w="3300" w:type="dxa"/>
+          </w:tcPr>
+          <w:p>
+            <w:pPr>
+              <w:pStyle w:val="Compact"/>
+              <w:rPr>
+                <w:ins w:id="12183" w:author="Claude" w:date="2026-10-25T13:49:46Z"/>
+              </w:rPr>
+            </w:pPr>
+            <w:ins w:id="12184" w:author="Claude" w:date="2026-10-25T13:49:46Z">
+              <w:r>
+                <w:t xml:space="preserve">07  Phase 1 – Vorabprüfung beziehungsweise Dokumentenprüfung</w:t>
+              </w:r>
+            </w:ins>
+          </w:p>
+        </w:tc>
+        <w:tc>
+          <w:tcPr>
+            <w:tcW w:w="2650" w:type="dxa"/>
+          </w:tcPr>
+          <w:p>
+            <w:pPr>
+              <w:pStyle w:val="Compact"/>
+              <w:rPr>
+                <w:ins w:id="12185" w:author="Claude" w:date="2026-10-25T13:49:46Z"/>
+              </w:rPr>
+            </w:pPr>
+            <w:ins w:id="12186" w:author="Claude" w:date="2026-10-25T13:49:46Z">
+              <w:r>
+                <w:t xml:space="preserve">Auditor</w:t>
+              </w:r>
+            </w:ins>
+          </w:p>
+        </w:tc>
+        <w:tc>
+          <w:tcPr>
+            <w:tcW w:w="2998" w:type="dxa"/>
+          </w:tcPr>
+          <w:p>
+            <w:pPr>
+              <w:pStyle w:val="Compact"/>
+              <w:rPr>
+                <w:ins w:id="12187" w:author="Claude" w:date="2026-10-25T13:49:46Z"/>
+              </w:rPr>
+            </w:pPr>
+            <w:ins w:id="12188" w:author="Claude" w:date="2026-10-25T13:49:46Z">
+              <w:r>
+                <w:t xml:space="preserve">Freigabe zur Phase 2, Nachbesserungsaufforderung oder Auditabbruch</w:t>
+              </w:r>
+            </w:ins>
+          </w:p>
+        </w:tc>
+      </w:tr>
+      <w:tr>
+        <w:trPr>
+          <w:cantSplit/>
+          <w:ins w:id="12189" w:author="Claude" w:date="2026-10-25T13:49:46Z"/>
+        </w:trPr>
+        <w:tc>
+          <w:tcPr>
+            <w:tcW w:w="3300" w:type="dxa"/>
+          </w:tcPr>
+          <w:p>
+            <w:pPr>
+              <w:pStyle w:val="Compact"/>
+              <w:rPr>
+                <w:ins w:id="12190" w:author="Claude" w:date="2026-10-25T13:49:46Z"/>
+              </w:rPr>
+            </w:pPr>
+            <w:ins w:id="12191" w:author="Claude" w:date="2026-10-25T13:49:46Z">
+              <w:r>
+                <w:t xml:space="preserve">08  Phase 2 – Hauptprüfung</w:t>
+              </w:r>
+            </w:ins>
+          </w:p>
+        </w:tc>
+        <w:tc>
+          <w:tcPr>
+            <w:tcW w:w="2650" w:type="dxa"/>
+          </w:tcPr>
+          <w:p>
+            <w:pPr>
+              <w:pStyle w:val="Compact"/>
+              <w:rPr>
+                <w:ins w:id="12192" w:author="Claude" w:date="2026-10-25T13:49:46Z"/>
+              </w:rPr>
+            </w:pPr>
+            <w:ins w:id="12193" w:author="Claude" w:date="2026-10-25T13:49:46Z">
+              <w:r>
+                <w:t xml:space="preserve">Auditor (Mitwirkung: geprüftes Unternehmen)</w:t>
+              </w:r>
+            </w:ins>
+          </w:p>
+        </w:tc>
+        <w:tc>
+          <w:tcPr>
+            <w:tcW w:w="2998" w:type="dxa"/>
+          </w:tcPr>
+          <w:p>
+            <w:pPr>
+              <w:pStyle w:val="Compact"/>
+              <w:rPr>
+                <w:ins w:id="12194" w:author="Claude" w:date="2026-10-25T13:49:46Z"/>
+              </w:rPr>
+            </w:pPr>
+            <w:ins w:id="12195" w:author="Claude" w:date="2026-10-25T13:49:46Z">
+              <w:r>
+                <w:t xml:space="preserve">Prüfnachweise, Auditnotizen</w:t>
+              </w:r>
+            </w:ins>
+          </w:p>
+        </w:tc>
+      </w:tr>
+      <w:tr>
+        <w:trPr>
+          <w:cantSplit/>
+          <w:ins w:id="12196" w:author="Claude" w:date="2026-10-25T13:49:46Z"/>
+        </w:trPr>
+        <w:tc>
+          <w:tcPr>
+            <w:tcW w:w="3300" w:type="dxa"/>
+          </w:tcPr>
+          <w:p>
+            <w:pPr>
+              <w:pStyle w:val="Compact"/>
+              <w:rPr>
+                <w:ins w:id="12197" w:author="Claude" w:date="2026-10-25T13:49:46Z"/>
+              </w:rPr>
+            </w:pPr>
+            <w:ins w:id="12198" w:author="Claude" w:date="2026-10-25T13:49:46Z">
+              <w:r>
+                <w:t xml:space="preserve">09  Bewertung, Security Score und Feststellungen</w:t>
+              </w:r>
+            </w:ins>
+          </w:p>
+        </w:tc>
+        <w:tc>
+          <w:tcPr>
+            <w:tcW w:w="2650" w:type="dxa"/>
+          </w:tcPr>
+          <w:p>
+            <w:pPr>
+              <w:pStyle w:val="Compact"/>
+              <w:rPr>
+                <w:ins w:id="12199" w:author="Claude" w:date="2026-10-25T13:49:46Z"/>
+              </w:rPr>
+            </w:pPr>
+            <w:ins w:id="12200" w:author="Claude" w:date="2026-10-25T13:49:46Z">
+              <w:r>
+                <w:t xml:space="preserve">Auditor</w:t>
+              </w:r>
+            </w:ins>
+          </w:p>
+        </w:tc>
+        <w:tc>
+          <w:tcPr>
+            <w:tcW w:w="2998" w:type="dxa"/>
+          </w:tcPr>
+          <w:p>
+            <w:pPr>
+              <w:pStyle w:val="Compact"/>
+              <w:rPr>
+                <w:ins w:id="12201" w:author="Claude" w:date="2026-10-25T13:49:46Z"/>
+              </w:rPr>
+            </w:pPr>
+            <w:ins w:id="12202" w:author="Claude" w:date="2026-10-25T13:49:46Z">
+              <w:r>
+                <w:t xml:space="preserve">bewerteter Prüfkatalog, Security Score, Feststellungsliste</w:t>
+              </w:r>
+            </w:ins>
+          </w:p>
+        </w:tc>
+      </w:tr>
+      <w:tr>
+        <w:trPr>
+          <w:cantSplit/>
+          <w:ins w:id="12203" w:author="Claude" w:date="2026-10-25T13:49:46Z"/>
+        </w:trPr>
+        <w:tc>
+          <w:tcPr>
+            <w:tcW w:w="3300" w:type="dxa"/>
+          </w:tcPr>
+          <w:p>
+            <w:pPr>
+              <w:pStyle w:val="Compact"/>
+              <w:rPr>
+                <w:ins w:id="12204" w:author="Claude" w:date="2026-10-25T13:49:46Z"/>
+              </w:rPr>
+            </w:pPr>
+            <w:ins w:id="12205" w:author="Claude" w:date="2026-10-25T13:49:46Z">
+              <w:r>
+                <w:t xml:space="preserve">10  Closing Meeting</w:t>
+              </w:r>
+            </w:ins>
+          </w:p>
+        </w:tc>
+        <w:tc>
+          <w:tcPr>
+            <w:tcW w:w="2650" w:type="dxa"/>
+          </w:tcPr>
+          <w:p>
+            <w:pPr>
+              <w:pStyle w:val="Compact"/>
+              <w:rPr>
+                <w:ins w:id="12206" w:author="Claude" w:date="2026-10-25T13:49:46Z"/>
+              </w:rPr>
+            </w:pPr>
+            <w:ins w:id="12207" w:author="Claude" w:date="2026-10-25T13:49:46Z">
+              <w:r>
+                <w:t xml:space="preserve">Auditor (Mitwirkung: geprüftes Unternehmen)</w:t>
+              </w:r>
+            </w:ins>
+          </w:p>
+        </w:tc>
+        <w:tc>
+          <w:tcPr>
+            <w:tcW w:w="2998" w:type="dxa"/>
+          </w:tcPr>
+          <w:p>
+            <w:pPr>
+              <w:pStyle w:val="Compact"/>
+              <w:rPr>
+                <w:ins w:id="12208" w:author="Claude" w:date="2026-10-25T13:49:46Z"/>
+              </w:rPr>
+            </w:pPr>
+            <w:ins w:id="12209" w:author="Claude" w:date="2026-10-25T13:49:46Z">
+              <w:r>
+                <w:t xml:space="preserve">vorläufiges Prüfergebnis, abgestimmte nächste Schritte</w:t>
+              </w:r>
+            </w:ins>
+          </w:p>
+        </w:tc>
+      </w:tr>
+      <w:tr>
+        <w:trPr>
+          <w:cantSplit/>
+          <w:ins w:id="12210" w:author="Claude" w:date="2026-10-25T13:49:46Z"/>
+        </w:trPr>
+        <w:tc>
+          <w:tcPr>
+            <w:tcW w:w="3300" w:type="dxa"/>
+          </w:tcPr>
+          <w:p>
+            <w:pPr>
+              <w:pStyle w:val="Compact"/>
+              <w:rPr>
+                <w:ins w:id="12211" w:author="Claude" w:date="2026-10-25T13:49:46Z"/>
+              </w:rPr>
+            </w:pPr>
+            <w:ins w:id="12212" w:author="Claude" w:date="2026-10-25T13:49:46Z">
+              <w:r>
+                <w:t xml:space="preserve">11  Prüfbericht erstellen</w:t>
+              </w:r>
+            </w:ins>
+          </w:p>
+        </w:tc>
+        <w:tc>
+          <w:tcPr>
+            <w:tcW w:w="2650" w:type="dxa"/>
+          </w:tcPr>
+          <w:p>
+            <w:pPr>
+              <w:pStyle w:val="Compact"/>
+              <w:rPr>
+                <w:ins w:id="12213" w:author="Claude" w:date="2026-10-25T13:49:46Z"/>
+              </w:rPr>
+            </w:pPr>
+            <w:ins w:id="12214" w:author="Claude" w:date="2026-10-25T13:49:46Z">
+              <w:r>
+                <w:t xml:space="preserve">CADIS®-Fachbereich (Mitwirkung: Auditor (fachliche Zuarbeit))</w:t>
+              </w:r>
+            </w:ins>
+          </w:p>
+        </w:tc>
+        <w:tc>
+          <w:tcPr>
+            <w:tcW w:w="2998" w:type="dxa"/>
+          </w:tcPr>
+          <w:p>
+            <w:pPr>
+              <w:pStyle w:val="Compact"/>
+              <w:rPr>
+                <w:ins w:id="12215" w:author="Claude" w:date="2026-10-25T13:49:46Z"/>
+              </w:rPr>
+            </w:pPr>
+            <w:ins w:id="12216" w:author="Claude" w:date="2026-10-25T13:49:46Z">
+              <w:r>
+                <w:t xml:space="preserve">Prüfbericht</w:t>
+              </w:r>
+            </w:ins>
+          </w:p>
+        </w:tc>
+      </w:tr>
+      <w:tr>
+        <w:trPr>
+          <w:cantSplit/>
+          <w:ins w:id="12217" w:author="Claude" w:date="2026-10-25T13:49:46Z"/>
+        </w:trPr>
+        <w:tc>
+          <w:tcPr>
+            <w:tcW w:w="3300" w:type="dxa"/>
+          </w:tcPr>
+          <w:p>
+            <w:pPr>
+              <w:pStyle w:val="Compact"/>
+              <w:rPr>
+                <w:ins w:id="12218" w:author="Claude" w:date="2026-10-25T13:49:46Z"/>
+              </w:rPr>
+            </w:pPr>
+            <w:ins w:id="12219" w:author="Claude" w:date="2026-10-25T13:49:46Z">
+              <w:r>
+                <w:t xml:space="preserve">12  Ergebnismeldung und Freigabeentscheidung</w:t>
+              </w:r>
+            </w:ins>
+          </w:p>
+        </w:tc>
+        <w:tc>
+          <w:tcPr>
+            <w:tcW w:w="2650" w:type="dxa"/>
+          </w:tcPr>
+          <w:p>
+            <w:pPr>
+              <w:pStyle w:val="Compact"/>
+              <w:rPr>
+                <w:ins w:id="12220" w:author="Claude" w:date="2026-10-25T13:49:46Z"/>
+              </w:rPr>
+            </w:pPr>
+            <w:ins w:id="12221" w:author="Claude" w:date="2026-10-25T13:49:46Z">
+              <w:r>
+                <w:t xml:space="preserve">CADIS®-Fachbereich (Mitwirkung: geprüftes Unternehmen)</w:t>
+              </w:r>
+            </w:ins>
+          </w:p>
+        </w:tc>
+        <w:tc>
+          <w:tcPr>
+            <w:tcW w:w="2998" w:type="dxa"/>
+          </w:tcPr>
+          <w:p>
+            <w:pPr>
+              <w:pStyle w:val="Compact"/>
+              <w:rPr>
+                <w:ins w:id="12222" w:author="Claude" w:date="2026-10-25T13:49:46Z"/>
+              </w:rPr>
+            </w:pPr>
+            <w:ins w:id="12223" w:author="Claude" w:date="2026-10-25T13:49:46Z">
+              <w:r>
+                <w:t xml:space="preserve">Eintrag in der CADIS®-Datenbank, Freigabeentscheidung</w:t>
+              </w:r>
+            </w:ins>
+          </w:p>
+        </w:tc>
+      </w:tr>
+      <w:tr>
+        <w:trPr>
+          <w:cantSplit/>
+          <w:ins w:id="12224" w:author="Claude" w:date="2026-10-25T13:49:46Z"/>
+        </w:trPr>
+        <w:tc>
+          <w:tcPr>
+            <w:tcW w:w="3300" w:type="dxa"/>
+          </w:tcPr>
+          <w:p>
+            <w:pPr>
+              <w:pStyle w:val="Compact"/>
+              <w:rPr>
+                <w:ins w:id="12225" w:author="Claude" w:date="2026-10-25T13:49:46Z"/>
+              </w:rPr>
+            </w:pPr>
+            <w:ins w:id="12226" w:author="Claude" w:date="2026-10-25T13:49:46Z">
+              <w:r>
+                <w:t xml:space="preserve">M-01  Maßnahmenplan erstellen und einreichen</w:t>
+              </w:r>
+            </w:ins>
+          </w:p>
+        </w:tc>
+        <w:tc>
+          <w:tcPr>
+            <w:tcW w:w="2650" w:type="dxa"/>
+          </w:tcPr>
+          <w:p>
+            <w:pPr>
+              <w:pStyle w:val="Compact"/>
+              <w:rPr>
+                <w:ins w:id="12227" w:author="Claude" w:date="2026-10-25T13:49:46Z"/>
+              </w:rPr>
+            </w:pPr>
+            <w:ins w:id="12228" w:author="Claude" w:date="2026-10-25T13:49:46Z">
+              <w:r>
+                <w:t xml:space="preserve">geprüftes Unternehmen</w:t>
+              </w:r>
+            </w:ins>
+          </w:p>
+        </w:tc>
+        <w:tc>
+          <w:tcPr>
+            <w:tcW w:w="2998" w:type="dxa"/>
+          </w:tcPr>
+          <w:p>
+            <w:pPr>
+              <w:pStyle w:val="Compact"/>
+              <w:rPr>
+                <w:ins w:id="12229" w:author="Claude" w:date="2026-10-25T13:49:46Z"/>
+              </w:rPr>
+            </w:pPr>
+            <w:ins w:id="12230" w:author="Claude" w:date="2026-10-25T13:49:46Z">
+              <w:r>
+                <w:t xml:space="preserve">eingereichter Maßnahmenplan</w:t>
+              </w:r>
+            </w:ins>
+          </w:p>
+        </w:tc>
+      </w:tr>
+      <w:tr>
+        <w:trPr>
+          <w:cantSplit/>
+          <w:ins w:id="12231" w:author="Claude" w:date="2026-10-25T13:49:46Z"/>
+        </w:trPr>
+        <w:tc>
+          <w:tcPr>
+            <w:tcW w:w="3300" w:type="dxa"/>
+          </w:tcPr>
+          <w:p>
+            <w:pPr>
+              <w:pStyle w:val="Compact"/>
+              <w:rPr>
+                <w:ins w:id="12232" w:author="Claude" w:date="2026-10-25T13:49:46Z"/>
+              </w:rPr>
+            </w:pPr>
+            <w:ins w:id="12233" w:author="Claude" w:date="2026-10-25T13:49:46Z">
+              <w:r>
+                <w:t xml:space="preserve">M-02  Maßnahmenplan bewerten</w:t>
+              </w:r>
+            </w:ins>
+          </w:p>
+        </w:tc>
+        <w:tc>
+          <w:tcPr>
+            <w:tcW w:w="2650" w:type="dxa"/>
+          </w:tcPr>
+          <w:p>
+            <w:pPr>
+              <w:pStyle w:val="Compact"/>
+              <w:rPr>
+                <w:ins w:id="12234" w:author="Claude" w:date="2026-10-25T13:49:46Z"/>
+              </w:rPr>
+            </w:pPr>
+            <w:ins w:id="12235" w:author="Claude" w:date="2026-10-25T13:49:46Z">
+              <w:r>
+                <w:t xml:space="preserve">Auditor</w:t>
+              </w:r>
+            </w:ins>
+          </w:p>
+        </w:tc>
+        <w:tc>
+          <w:tcPr>
+            <w:tcW w:w="2998" w:type="dxa"/>
+          </w:tcPr>
+          <w:p>
+            <w:pPr>
+              <w:pStyle w:val="Compact"/>
+              <w:rPr>
+                <w:ins w:id="12236" w:author="Claude" w:date="2026-10-25T13:49:46Z"/>
+              </w:rPr>
+            </w:pPr>
+            <w:ins w:id="12237" w:author="Claude" w:date="2026-10-25T13:49:46Z">
+              <w:r>
+                <w:t xml:space="preserve">Maßnahmenplan geeignet, Nachbesserungsaufforderung oder Eskalation</w:t>
+              </w:r>
+            </w:ins>
+          </w:p>
+        </w:tc>
+      </w:tr>
+      <w:tr>
+        <w:trPr>
+          <w:cantSplit/>
+          <w:ins w:id="12238" w:author="Claude" w:date="2026-10-25T13:49:46Z"/>
+        </w:trPr>
+        <w:tc>
+          <w:tcPr>
+            <w:tcW w:w="3300" w:type="dxa"/>
+          </w:tcPr>
+          <w:p>
+            <w:pPr>
+              <w:pStyle w:val="Compact"/>
+              <w:rPr>
+                <w:ins w:id="12239" w:author="Claude" w:date="2026-10-25T13:49:46Z"/>
+              </w:rPr>
+            </w:pPr>
+            <w:ins w:id="12240" w:author="Claude" w:date="2026-10-25T13:49:46Z">
+              <w:r>
+                <w:t xml:space="preserve">M-03  Fristen festlegen und Maßnahmenplan freigeben</w:t>
+              </w:r>
+            </w:ins>
+          </w:p>
+        </w:tc>
+        <w:tc>
+          <w:tcPr>
+            <w:tcW w:w="2650" w:type="dxa"/>
+          </w:tcPr>
+          <w:p>
+            <w:pPr>
+              <w:pStyle w:val="Compact"/>
+              <w:rPr>
+                <w:ins w:id="12241" w:author="Claude" w:date="2026-10-25T13:49:46Z"/>
+              </w:rPr>
+            </w:pPr>
+            <w:ins w:id="12242" w:author="Claude" w:date="2026-10-25T13:49:46Z">
+              <w:r>
+                <w:t xml:space="preserve">Auditor</w:t>
+              </w:r>
+            </w:ins>
+          </w:p>
+        </w:tc>
+        <w:tc>
+          <w:tcPr>
+            <w:tcW w:w="2998" w:type="dxa"/>
+          </w:tcPr>
+          <w:p>
+            <w:pPr>
+              <w:pStyle w:val="Compact"/>
+              <w:rPr>
+                <w:ins w:id="12243" w:author="Claude" w:date="2026-10-25T13:49:46Z"/>
+              </w:rPr>
+            </w:pPr>
+            <w:ins w:id="12244" w:author="Claude" w:date="2026-10-25T13:49:46Z">
+              <w:r>
+                <w:t xml:space="preserve">freigegebener Maßnahmenplan mit Fristen</w:t>
+              </w:r>
+            </w:ins>
+          </w:p>
+        </w:tc>
+      </w:tr>
+      <w:tr>
+        <w:trPr>
+          <w:cantSplit/>
+          <w:ins w:id="12245" w:author="Claude" w:date="2026-10-25T13:49:46Z"/>
+        </w:trPr>
+        <w:tc>
+          <w:tcPr>
+            <w:tcW w:w="3300" w:type="dxa"/>
+          </w:tcPr>
+          <w:p>
+            <w:pPr>
+              <w:pStyle w:val="Compact"/>
+              <w:rPr>
+                <w:ins w:id="12246" w:author="Claude" w:date="2026-10-25T13:49:46Z"/>
+              </w:rPr>
+            </w:pPr>
+            <w:ins w:id="12247" w:author="Claude" w:date="2026-10-25T13:49:46Z">
+              <w:r>
+                <w:t xml:space="preserve">M-04  Statusaktualisierung und Fristenüberwachung</w:t>
+              </w:r>
+            </w:ins>
+          </w:p>
+        </w:tc>
+        <w:tc>
+          <w:tcPr>
+            <w:tcW w:w="2650" w:type="dxa"/>
+          </w:tcPr>
+          <w:p>
+            <w:pPr>
+              <w:pStyle w:val="Compact"/>
+              <w:rPr>
+                <w:ins w:id="12248" w:author="Claude" w:date="2026-10-25T13:49:46Z"/>
+              </w:rPr>
+            </w:pPr>
+            <w:ins w:id="12249" w:author="Claude" w:date="2026-10-25T13:49:46Z">
+              <w:r>
+                <w:t xml:space="preserve">CADIS®-Fachbereich</w:t>
+              </w:r>
+            </w:ins>
+          </w:p>
+        </w:tc>
+        <w:tc>
+          <w:tcPr>
+            <w:tcW w:w="2998" w:type="dxa"/>
+          </w:tcPr>
+          <w:p>
+            <w:pPr>
+              <w:pStyle w:val="Compact"/>
+              <w:rPr>
+                <w:ins w:id="12250" w:author="Claude" w:date="2026-10-25T13:49:46Z"/>
+              </w:rPr>
+            </w:pPr>
+            <w:ins w:id="12251" w:author="Claude" w:date="2026-10-25T13:49:46Z">
+              <w:r>
+                <w:t xml:space="preserve">aktualisierter Status, Fristenüberwachung</w:t>
+              </w:r>
+            </w:ins>
+          </w:p>
+        </w:tc>
+      </w:tr>
+      <w:tr>
+        <w:trPr>
+          <w:cantSplit/>
+          <w:ins w:id="12252" w:author="Claude" w:date="2026-10-25T13:49:46Z"/>
+        </w:trPr>
+        <w:tc>
+          <w:tcPr>
+            <w:tcW w:w="3300" w:type="dxa"/>
+          </w:tcPr>
+          <w:p>
+            <w:pPr>
+              <w:pStyle w:val="Compact"/>
+              <w:rPr>
+                <w:ins w:id="12253" w:author="Claude" w:date="2026-10-25T13:49:46Z"/>
+              </w:rPr>
+            </w:pPr>
+            <w:ins w:id="12254" w:author="Claude" w:date="2026-10-25T13:49:46Z">
+              <w:r>
+                <w:t xml:space="preserve">F-01  Korrekturmaßnahmen umsetzen</w:t>
+              </w:r>
+            </w:ins>
+          </w:p>
+        </w:tc>
+        <w:tc>
+          <w:tcPr>
+            <w:tcW w:w="2650" w:type="dxa"/>
+          </w:tcPr>
+          <w:p>
+            <w:pPr>
+              <w:pStyle w:val="Compact"/>
+              <w:rPr>
+                <w:ins w:id="12255" w:author="Claude" w:date="2026-10-25T13:49:46Z"/>
+              </w:rPr>
+            </w:pPr>
+            <w:ins w:id="12256" w:author="Claude" w:date="2026-10-25T13:49:46Z">
+              <w:r>
+                <w:t xml:space="preserve">geprüftes Unternehmen</w:t>
+              </w:r>
+            </w:ins>
+          </w:p>
+        </w:tc>
+        <w:tc>
+          <w:tcPr>
+            <w:tcW w:w="2998" w:type="dxa"/>
+          </w:tcPr>
+          <w:p>
+            <w:pPr>
+              <w:pStyle w:val="Compact"/>
+              <w:rPr>
+                <w:ins w:id="12257" w:author="Claude" w:date="2026-10-25T13:49:46Z"/>
+              </w:rPr>
+            </w:pPr>
+            <w:ins w:id="12258" w:author="Claude" w:date="2026-10-25T13:49:46Z">
+              <w:r>
+                <w:t xml:space="preserve">umgesetzte Maßnahmen, Wirksamkeitsnachweise</w:t>
+              </w:r>
+            </w:ins>
+          </w:p>
+        </w:tc>
+      </w:tr>
+      <w:tr>
+        <w:trPr>
+          <w:cantSplit/>
+          <w:ins w:id="12259" w:author="Claude" w:date="2026-10-25T13:49:46Z"/>
+        </w:trPr>
+        <w:tc>
+          <w:tcPr>
+            <w:tcW w:w="3300" w:type="dxa"/>
+          </w:tcPr>
+          <w:p>
+            <w:pPr>
+              <w:pStyle w:val="Compact"/>
+              <w:rPr>
+                <w:ins w:id="12260" w:author="Claude" w:date="2026-10-25T13:49:46Z"/>
+              </w:rPr>
+            </w:pPr>
+            <w:ins w:id="12261" w:author="Claude" w:date="2026-10-25T13:49:46Z">
+              <w:r>
+                <w:t xml:space="preserve">F-02  Nachweise einreichen und Follow-Up anfordern</w:t>
+              </w:r>
+            </w:ins>
+          </w:p>
+        </w:tc>
+        <w:tc>
+          <w:tcPr>
+            <w:tcW w:w="2650" w:type="dxa"/>
+          </w:tcPr>
+          <w:p>
+            <w:pPr>
+              <w:pStyle w:val="Compact"/>
+              <w:rPr>
+                <w:ins w:id="12262" w:author="Claude" w:date="2026-10-25T13:49:46Z"/>
+              </w:rPr>
+            </w:pPr>
+            <w:ins w:id="12263" w:author="Claude" w:date="2026-10-25T13:49:46Z">
+              <w:r>
+                <w:t xml:space="preserve">geprüftes Unternehmen</w:t>
+              </w:r>
+            </w:ins>
+          </w:p>
+        </w:tc>
+        <w:tc>
+          <w:tcPr>
+            <w:tcW w:w="2998" w:type="dxa"/>
+          </w:tcPr>
+          <w:p>
+            <w:pPr>
+              <w:pStyle w:val="Compact"/>
+              <w:rPr>
+                <w:ins w:id="12264" w:author="Claude" w:date="2026-10-25T13:49:46Z"/>
+              </w:rPr>
+            </w:pPr>
+            <w:ins w:id="12265" w:author="Claude" w:date="2026-10-25T13:49:46Z">
+              <w:r>
+                <w:t xml:space="preserve">Follow-Up-Beauftragung, Nachweispaket</w:t>
+              </w:r>
+            </w:ins>
+          </w:p>
+        </w:tc>
+      </w:tr>
+      <w:tr>
+        <w:trPr>
+          <w:cantSplit/>
+          <w:ins w:id="12266" w:author="Claude" w:date="2026-10-25T13:49:46Z"/>
+        </w:trPr>
+        <w:tc>
+          <w:tcPr>
+            <w:tcW w:w="3300" w:type="dxa"/>
+          </w:tcPr>
+          <w:p>
+            <w:pPr>
+              <w:pStyle w:val="Compact"/>
+              <w:rPr>
+                <w:ins w:id="12267" w:author="Claude" w:date="2026-10-25T13:49:46Z"/>
+              </w:rPr>
+            </w:pPr>
+            <w:ins w:id="12268" w:author="Claude" w:date="2026-10-25T13:49:46Z">
+              <w:r>
+                <w:t xml:space="preserve">F-03  Wirksamkeit verifizieren</w:t>
+              </w:r>
+            </w:ins>
+          </w:p>
+        </w:tc>
+        <w:tc>
+          <w:tcPr>
+            <w:tcW w:w="2650" w:type="dxa"/>
+          </w:tcPr>
+          <w:p>
+            <w:pPr>
+              <w:pStyle w:val="Compact"/>
+              <w:rPr>
+                <w:ins w:id="12269" w:author="Claude" w:date="2026-10-25T13:49:46Z"/>
+              </w:rPr>
+            </w:pPr>
+            <w:ins w:id="12270" w:author="Claude" w:date="2026-10-25T13:49:46Z">
+              <w:r>
+                <w:t xml:space="preserve">Auditor</w:t>
+              </w:r>
+            </w:ins>
+          </w:p>
+        </w:tc>
+        <w:tc>
+          <w:tcPr>
+            <w:tcW w:w="2998" w:type="dxa"/>
+          </w:tcPr>
+          <w:p>
+            <w:pPr>
+              <w:pStyle w:val="Compact"/>
+              <w:rPr>
+                <w:ins w:id="12271" w:author="Claude" w:date="2026-10-25T13:49:46Z"/>
+              </w:rPr>
+            </w:pPr>
+            <w:ins w:id="12272" w:author="Claude" w:date="2026-10-25T13:49:46Z">
+              <w:r>
+                <w:t xml:space="preserve">Bewertung je Abweichung</w:t>
+              </w:r>
+            </w:ins>
+          </w:p>
+        </w:tc>
+      </w:tr>
+      <w:tr>
+        <w:trPr>
+          <w:cantSplit/>
+          <w:ins w:id="12273" w:author="Claude" w:date="2026-10-25T13:49:46Z"/>
+        </w:trPr>
+        <w:tc>
+          <w:tcPr>
+            <w:tcW w:w="3300" w:type="dxa"/>
+          </w:tcPr>
+          <w:p>
+            <w:pPr>
+              <w:pStyle w:val="Compact"/>
+              <w:rPr>
+                <w:ins w:id="12274" w:author="Claude" w:date="2026-10-25T13:49:46Z"/>
+              </w:rPr>
+            </w:pPr>
+            <w:ins w:id="12275" w:author="Claude" w:date="2026-10-25T13:49:46Z">
+              <w:r>
+                <w:t xml:space="preserve">F-04  Statusaktualisierung und Freigabe</w:t>
+              </w:r>
+            </w:ins>
+          </w:p>
+        </w:tc>
+        <w:tc>
+          <w:tcPr>
+            <w:tcW w:w="2650" w:type="dxa"/>
+          </w:tcPr>
+          <w:p>
+            <w:pPr>
+              <w:pStyle w:val="Compact"/>
+              <w:rPr>
+                <w:ins w:id="12276" w:author="Claude" w:date="2026-10-25T13:49:46Z"/>
+              </w:rPr>
+            </w:pPr>
+            <w:ins w:id="12277" w:author="Claude" w:date="2026-10-25T13:49:46Z">
+              <w:r>
+                <w:t xml:space="preserve">CADIS®-Fachbereich (Mitwirkung: Auditor)</w:t>
+              </w:r>
+            </w:ins>
+          </w:p>
+        </w:tc>
+        <w:tc>
+          <w:tcPr>
+            <w:tcW w:w="2998" w:type="dxa"/>
+          </w:tcPr>
+          <w:p>
+            <w:pPr>
+              <w:pStyle w:val="Compact"/>
+              <w:rPr>
+                <w:ins w:id="12278" w:author="Claude" w:date="2026-10-25T13:49:46Z"/>
+              </w:rPr>
+            </w:pPr>
+            <w:ins w:id="12279" w:author="Claude" w:date="2026-10-25T13:49:46Z">
+              <w:r>
+                <w:t xml:space="preserve">Follow-Up-Bericht, aktualisierter Freigabestatus</w:t>
+              </w:r>
+            </w:ins>
+          </w:p>
+        </w:tc>
+      </w:tr>
+      <w:tr>
+        <w:trPr>
+          <w:cantSplit/>
+          <w:ins w:id="12280" w:author="Claude" w:date="2026-10-25T13:49:46Z"/>
+        </w:trPr>
+        <w:tc>
+          <w:tcPr>
+            <w:tcW w:w="3300" w:type="dxa"/>
+          </w:tcPr>
+          <w:p>
+            <w:pPr>
+              <w:pStyle w:val="Compact"/>
+              <w:rPr>
+                <w:ins w:id="12281" w:author="Claude" w:date="2026-10-25T13:49:46Z"/>
+              </w:rPr>
+            </w:pPr>
+            <w:ins w:id="12282" w:author="Claude" w:date="2026-10-25T13:49:46Z">
+              <w:r>
+                <w:t xml:space="preserve">Ü-01  Beauftragung für das zweite Zyklusjahr</w:t>
+              </w:r>
+            </w:ins>
+          </w:p>
+        </w:tc>
+        <w:tc>
+          <w:tcPr>
+            <w:tcW w:w="2650" w:type="dxa"/>
+          </w:tcPr>
+          <w:p>
+            <w:pPr>
+              <w:pStyle w:val="Compact"/>
+              <w:rPr>
+                <w:ins w:id="12283" w:author="Claude" w:date="2026-10-25T13:49:46Z"/>
+              </w:rPr>
+            </w:pPr>
+            <w:ins w:id="12284" w:author="Claude" w:date="2026-10-25T13:49:46Z">
+              <w:r>
+                <w:t xml:space="preserve">CADIS®-Fachbereich (Mitwirkung: geprüftes Unternehmen)</w:t>
+              </w:r>
+            </w:ins>
+          </w:p>
+        </w:tc>
+        <w:tc>
+          <w:tcPr>
+            <w:tcW w:w="2998" w:type="dxa"/>
+          </w:tcPr>
+          <w:p>
+            <w:pPr>
+              <w:pStyle w:val="Compact"/>
+              <w:rPr>
+                <w:ins w:id="12285" w:author="Claude" w:date="2026-10-25T13:49:46Z"/>
+              </w:rPr>
+            </w:pPr>
+            <w:ins w:id="12286" w:author="Claude" w:date="2026-10-25T13:49:46Z">
+              <w:r>
+                <w:t xml:space="preserve">beauftragte Überwachungsprüfung</w:t>
+              </w:r>
+            </w:ins>
+          </w:p>
+        </w:tc>
+      </w:tr>
+      <w:tr>
+        <w:trPr>
+          <w:cantSplit/>
+          <w:ins w:id="12287" w:author="Claude" w:date="2026-10-25T13:49:46Z"/>
+        </w:trPr>
+        <w:tc>
+          <w:tcPr>
+            <w:tcW w:w="3300" w:type="dxa"/>
+          </w:tcPr>
+          <w:p>
+            <w:pPr>
+              <w:pStyle w:val="Compact"/>
+              <w:rPr>
+                <w:ins w:id="12288" w:author="Claude" w:date="2026-10-25T13:49:46Z"/>
+              </w:rPr>
+            </w:pPr>
+            <w:ins w:id="12289" w:author="Claude" w:date="2026-10-25T13:49:46Z">
+              <w:r>
+                <w:t xml:space="preserve">Ü-02  Risikobasierte Prüfplanung</w:t>
+              </w:r>
+            </w:ins>
+          </w:p>
+        </w:tc>
+        <w:tc>
+          <w:tcPr>
+            <w:tcW w:w="2650" w:type="dxa"/>
+          </w:tcPr>
+          <w:p>
+            <w:pPr>
+              <w:pStyle w:val="Compact"/>
+              <w:rPr>
+                <w:ins w:id="12290" w:author="Claude" w:date="2026-10-25T13:49:46Z"/>
+              </w:rPr>
+            </w:pPr>
+            <w:ins w:id="12291" w:author="Claude" w:date="2026-10-25T13:49:46Z">
+              <w:r>
+                <w:t xml:space="preserve">Auditor</w:t>
+              </w:r>
+            </w:ins>
+          </w:p>
+        </w:tc>
+        <w:tc>
+          <w:tcPr>
+            <w:tcW w:w="2998" w:type="dxa"/>
+          </w:tcPr>
+          <w:p>
+            <w:pPr>
+              <w:pStyle w:val="Compact"/>
+              <w:rPr>
+                <w:ins w:id="12292" w:author="Claude" w:date="2026-10-25T13:49:46Z"/>
+              </w:rPr>
+            </w:pPr>
+            <w:ins w:id="12293" w:author="Claude" w:date="2026-10-25T13:49:46Z">
+              <w:r>
+                <w:t xml:space="preserve">risikobasierte Prüfpunktauswahl</w:t>
+              </w:r>
+            </w:ins>
+          </w:p>
+        </w:tc>
+      </w:tr>
+      <w:tr>
+        <w:trPr>
+          <w:cantSplit/>
+          <w:ins w:id="12294" w:author="Claude" w:date="2026-10-25T13:49:46Z"/>
+        </w:trPr>
+        <w:tc>
+          <w:tcPr>
+            <w:tcW w:w="3300" w:type="dxa"/>
+          </w:tcPr>
+          <w:p>
+            <w:pPr>
+              <w:pStyle w:val="Compact"/>
+              <w:rPr>
+                <w:ins w:id="12295" w:author="Claude" w:date="2026-10-25T13:49:46Z"/>
+              </w:rPr>
+            </w:pPr>
+            <w:ins w:id="12296" w:author="Claude" w:date="2026-10-25T13:49:46Z">
+              <w:r>
+                <w:t xml:space="preserve">Ü-03  Prüffragen mitteilen</w:t>
+              </w:r>
+            </w:ins>
+          </w:p>
+        </w:tc>
+        <w:tc>
+          <w:tcPr>
+            <w:tcW w:w="2650" w:type="dxa"/>
+          </w:tcPr>
+          <w:p>
+            <w:pPr>
+              <w:pStyle w:val="Compact"/>
+              <w:rPr>
+                <w:ins w:id="12297" w:author="Claude" w:date="2026-10-25T13:49:46Z"/>
+              </w:rPr>
+            </w:pPr>
+            <w:ins w:id="12298" w:author="Claude" w:date="2026-10-25T13:49:46Z">
+              <w:r>
+                <w:t xml:space="preserve">Auditor</w:t>
+              </w:r>
+            </w:ins>
+          </w:p>
+        </w:tc>
+        <w:tc>
+          <w:tcPr>
+            <w:tcW w:w="2998" w:type="dxa"/>
+          </w:tcPr>
+          <w:p>
+            <w:pPr>
+              <w:pStyle w:val="Compact"/>
+              <w:rPr>
+                <w:ins w:id="12299" w:author="Claude" w:date="2026-10-25T13:49:46Z"/>
+              </w:rPr>
+            </w:pPr>
+            <w:ins w:id="12300" w:author="Claude" w:date="2026-10-25T13:49:46Z">
+              <w:r>
+                <w:t xml:space="preserve">mitgeteilter Prüfumfang</w:t>
+              </w:r>
+            </w:ins>
+          </w:p>
+        </w:tc>
+      </w:tr>
+      <w:tr>
+        <w:trPr>
+          <w:cantSplit/>
+          <w:ins w:id="12301" w:author="Claude" w:date="2026-10-25T13:49:46Z"/>
+        </w:trPr>
+        <w:tc>
+          <w:tcPr>
+            <w:tcW w:w="3300" w:type="dxa"/>
+          </w:tcPr>
+          <w:p>
+            <w:pPr>
+              <w:pStyle w:val="Compact"/>
+              <w:rPr>
+                <w:ins w:id="12302" w:author="Claude" w:date="2026-10-25T13:49:46Z"/>
+              </w:rPr>
+            </w:pPr>
+            <w:ins w:id="12303" w:author="Claude" w:date="2026-10-25T13:49:46Z">
+              <w:r>
+                <w:t xml:space="preserve">Ü-04  Durchführung der Überwachungsprüfung</w:t>
+              </w:r>
+            </w:ins>
+          </w:p>
+        </w:tc>
+        <w:tc>
+          <w:tcPr>
+            <w:tcW w:w="2650" w:type="dxa"/>
+          </w:tcPr>
+          <w:p>
+            <w:pPr>
+              <w:pStyle w:val="Compact"/>
+              <w:rPr>
+                <w:ins w:id="12304" w:author="Claude" w:date="2026-10-25T13:49:46Z"/>
+              </w:rPr>
+            </w:pPr>
+            <w:ins w:id="12305" w:author="Claude" w:date="2026-10-25T13:49:46Z">
+              <w:r>
+                <w:t xml:space="preserve">Auditor (Mitwirkung: geprüftes Unternehmen)</w:t>
+              </w:r>
+            </w:ins>
+          </w:p>
+        </w:tc>
+        <w:tc>
+          <w:tcPr>
+            <w:tcW w:w="2998" w:type="dxa"/>
+          </w:tcPr>
+          <w:p>
+            <w:pPr>
+              <w:pStyle w:val="Compact"/>
+              <w:rPr>
+                <w:ins w:id="12306" w:author="Claude" w:date="2026-10-25T13:49:46Z"/>
+              </w:rPr>
+            </w:pPr>
+            <w:ins w:id="12307" w:author="Claude" w:date="2026-10-25T13:49:46Z">
+              <w:r>
+                <w:t xml:space="preserve">Prüfnachweise</w:t>
+              </w:r>
+            </w:ins>
+          </w:p>
+        </w:tc>
+      </w:tr>
+      <w:tr>
+        <w:trPr>
+          <w:cantSplit/>
+          <w:ins w:id="12308" w:author="Claude" w:date="2026-10-25T13:49:46Z"/>
+        </w:trPr>
+        <w:tc>
+          <w:tcPr>
+            <w:tcW w:w="3300" w:type="dxa"/>
+          </w:tcPr>
+          <w:p>
+            <w:pPr>
+              <w:pStyle w:val="Compact"/>
+              <w:rPr>
+                <w:ins w:id="12309" w:author="Claude" w:date="2026-10-25T13:49:46Z"/>
+              </w:rPr>
+            </w:pPr>
+            <w:ins w:id="12310" w:author="Claude" w:date="2026-10-25T13:49:46Z">
+              <w:r>
+                <w:t xml:space="preserve">Ü-05  Bewertung und Feststellungen</w:t>
+              </w:r>
+            </w:ins>
+          </w:p>
+        </w:tc>
+        <w:tc>
+          <w:tcPr>
+            <w:tcW w:w="2650" w:type="dxa"/>
+          </w:tcPr>
+          <w:p>
+            <w:pPr>
+              <w:pStyle w:val="Compact"/>
+              <w:rPr>
+                <w:ins w:id="12311" w:author="Claude" w:date="2026-10-25T13:49:46Z"/>
+              </w:rPr>
+            </w:pPr>
+            <w:ins w:id="12312" w:author="Claude" w:date="2026-10-25T13:49:46Z">
+              <w:r>
+                <w:t xml:space="preserve">Auditor</w:t>
+              </w:r>
+            </w:ins>
+          </w:p>
+        </w:tc>
+        <w:tc>
+          <w:tcPr>
+            <w:tcW w:w="2998" w:type="dxa"/>
+          </w:tcPr>
+          <w:p>
+            <w:pPr>
+              <w:pStyle w:val="Compact"/>
+              <w:rPr>
+                <w:ins w:id="12313" w:author="Claude" w:date="2026-10-25T13:49:46Z"/>
+              </w:rPr>
+            </w:pPr>
+            <w:ins w:id="12314" w:author="Claude" w:date="2026-10-25T13:49:46Z">
+              <w:r>
+                <w:t xml:space="preserve">Bewertung, Feststellungen, Fristen</w:t>
+              </w:r>
+            </w:ins>
+          </w:p>
+        </w:tc>
+      </w:tr>
+      <w:tr>
+        <w:trPr>
+          <w:cantSplit/>
+          <w:ins w:id="12315" w:author="Claude" w:date="2026-10-25T13:49:46Z"/>
+        </w:trPr>
+        <w:tc>
+          <w:tcPr>
+            <w:tcW w:w="3300" w:type="dxa"/>
+          </w:tcPr>
+          <w:p>
+            <w:pPr>
+              <w:pStyle w:val="Compact"/>
+              <w:rPr>
+                <w:ins w:id="12316" w:author="Claude" w:date="2026-10-25T13:49:46Z"/>
+              </w:rPr>
+            </w:pPr>
+            <w:ins w:id="12317" w:author="Claude" w:date="2026-10-25T13:49:46Z">
+              <w:r>
+                <w:t xml:space="preserve">Ü-06  Bericht, Meldung und Freigabestatus</w:t>
+              </w:r>
+            </w:ins>
+          </w:p>
+        </w:tc>
+        <w:tc>
+          <w:tcPr>
+            <w:tcW w:w="2650" w:type="dxa"/>
+          </w:tcPr>
+          <w:p>
+            <w:pPr>
+              <w:pStyle w:val="Compact"/>
+              <w:rPr>
+                <w:ins w:id="12318" w:author="Claude" w:date="2026-10-25T13:49:46Z"/>
+              </w:rPr>
+            </w:pPr>
+            <w:ins w:id="12319" w:author="Claude" w:date="2026-10-25T13:49:46Z">
+              <w:r>
+                <w:t xml:space="preserve">CADIS®-Fachbereich (Mitwirkung: Auditor)</w:t>
+              </w:r>
+            </w:ins>
+          </w:p>
+        </w:tc>
+        <w:tc>
+          <w:tcPr>
+            <w:tcW w:w="2998" w:type="dxa"/>
+          </w:tcPr>
+          <w:p>
+            <w:pPr>
+              <w:pStyle w:val="Compact"/>
+              <w:rPr>
+                <w:ins w:id="12320" w:author="Claude" w:date="2026-10-25T13:49:46Z"/>
+              </w:rPr>
+            </w:pPr>
+            <w:ins w:id="12321" w:author="Claude" w:date="2026-10-25T13:49:46Z">
+              <w:r>
+                <w:t xml:space="preserve">Bericht, aktualisierter Freigabestatus</w:t>
+              </w:r>
+            </w:ins>
+          </w:p>
+        </w:tc>
+      </w:tr>
+      <w:tr>
+        <w:trPr>
+          <w:cantSplit/>
+          <w:ins w:id="12322" w:author="Claude" w:date="2026-10-25T13:49:46Z"/>
+        </w:trPr>
+        <w:tc>
+          <w:tcPr>
+            <w:tcW w:w="3300" w:type="dxa"/>
+          </w:tcPr>
+          <w:p>
+            <w:pPr>
+              <w:pStyle w:val="Compact"/>
+              <w:rPr>
+                <w:ins w:id="12323" w:author="Claude" w:date="2026-10-25T13:49:46Z"/>
+              </w:rPr>
+            </w:pPr>
+            <w:ins w:id="12324" w:author="Claude" w:date="2026-10-25T13:49:46Z">
+              <w:r>
+                <w:t xml:space="preserve">E-01  Anstoß und Abstimmung der Scope-Änderung</w:t>
+              </w:r>
+            </w:ins>
+          </w:p>
+        </w:tc>
+        <w:tc>
+          <w:tcPr>
+            <w:tcW w:w="2650" w:type="dxa"/>
+          </w:tcPr>
+          <w:p>
+            <w:pPr>
+              <w:pStyle w:val="Compact"/>
+              <w:rPr>
+                <w:ins w:id="12325" w:author="Claude" w:date="2026-10-25T13:49:46Z"/>
+              </w:rPr>
+            </w:pPr>
+            <w:ins w:id="12326" w:author="Claude" w:date="2026-10-25T13:49:46Z">
+              <w:r>
+                <w:t xml:space="preserve">CADIS®-Fachbereich (Mitwirkung: geprüftes Unternehmen, Hersteller/Auftraggeber)</w:t>
+              </w:r>
+            </w:ins>
+          </w:p>
+        </w:tc>
+        <w:tc>
+          <w:tcPr>
+            <w:tcW w:w="2998" w:type="dxa"/>
+          </w:tcPr>
+          <w:p>
+            <w:pPr>
+              <w:pStyle w:val="Compact"/>
+              <w:rPr>
+                <w:ins w:id="12327" w:author="Claude" w:date="2026-10-25T13:49:46Z"/>
+              </w:rPr>
+            </w:pPr>
+            <w:ins w:id="12328" w:author="Claude" w:date="2026-10-25T13:49:46Z">
+              <w:r>
+                <w:t xml:space="preserve">dokumentierte Scope-Änderung</w:t>
+              </w:r>
+            </w:ins>
+          </w:p>
+        </w:tc>
+      </w:tr>
+      <w:tr>
+        <w:trPr>
+          <w:cantSplit/>
+          <w:ins w:id="12329" w:author="Claude" w:date="2026-10-25T13:49:46Z"/>
+        </w:trPr>
+        <w:tc>
+          <w:tcPr>
+            <w:tcW w:w="3300" w:type="dxa"/>
+          </w:tcPr>
+          <w:p>
+            <w:pPr>
+              <w:pStyle w:val="Compact"/>
+              <w:rPr>
+                <w:ins w:id="12330" w:author="Claude" w:date="2026-10-25T13:49:46Z"/>
+              </w:rPr>
+            </w:pPr>
+            <w:ins w:id="12331" w:author="Claude" w:date="2026-10-25T13:49:46Z">
+              <w:r>
+                <w:t xml:space="preserve">E-02  Planung des Erweiterungsumfangs</w:t>
+              </w:r>
+            </w:ins>
+          </w:p>
+        </w:tc>
+        <w:tc>
+          <w:tcPr>
+            <w:tcW w:w="2650" w:type="dxa"/>
+          </w:tcPr>
+          <w:p>
+            <w:pPr>
+              <w:pStyle w:val="Compact"/>
+              <w:rPr>
+                <w:ins w:id="12332" w:author="Claude" w:date="2026-10-25T13:49:46Z"/>
+              </w:rPr>
+            </w:pPr>
+            <w:ins w:id="12333" w:author="Claude" w:date="2026-10-25T13:49:46Z">
+              <w:r>
+                <w:t xml:space="preserve">Auditor</w:t>
+              </w:r>
+            </w:ins>
+          </w:p>
+        </w:tc>
+        <w:tc>
+          <w:tcPr>
+            <w:tcW w:w="2998" w:type="dxa"/>
+          </w:tcPr>
+          <w:p>
+            <w:pPr>
+              <w:pStyle w:val="Compact"/>
+              <w:rPr>
+                <w:ins w:id="12334" w:author="Claude" w:date="2026-10-25T13:49:46Z"/>
+              </w:rPr>
+            </w:pPr>
+            <w:ins w:id="12335" w:author="Claude" w:date="2026-10-25T13:49:46Z">
+              <w:r>
+                <w:t xml:space="preserve">Prüfplan der Erweiterungsprüfung</w:t>
+              </w:r>
+            </w:ins>
+          </w:p>
+        </w:tc>
+      </w:tr>
+      <w:tr>
+        <w:trPr>
+          <w:cantSplit/>
+          <w:ins w:id="12336" w:author="Claude" w:date="2026-10-25T13:49:46Z"/>
+        </w:trPr>
+        <w:tc>
+          <w:tcPr>
+            <w:tcW w:w="3300" w:type="dxa"/>
+          </w:tcPr>
+          <w:p>
+            <w:pPr>
+              <w:pStyle w:val="Compact"/>
+              <w:rPr>
+                <w:ins w:id="12337" w:author="Claude" w:date="2026-10-25T13:49:46Z"/>
+              </w:rPr>
+            </w:pPr>
+            <w:ins w:id="12338" w:author="Claude" w:date="2026-10-25T13:49:46Z">
+              <w:r>
+                <w:t xml:space="preserve">E-03  Durchführung der Erweiterungsprüfung</w:t>
+              </w:r>
+            </w:ins>
+          </w:p>
+        </w:tc>
+        <w:tc>
+          <w:tcPr>
+            <w:tcW w:w="2650" w:type="dxa"/>
+          </w:tcPr>
+          <w:p>
+            <w:pPr>
+              <w:pStyle w:val="Compact"/>
+              <w:rPr>
+                <w:ins w:id="12339" w:author="Claude" w:date="2026-10-25T13:49:46Z"/>
+              </w:rPr>
+            </w:pPr>
+            <w:ins w:id="12340" w:author="Claude" w:date="2026-10-25T13:49:46Z">
+              <w:r>
+                <w:t xml:space="preserve">Auditor (Mitwirkung: geprüftes Unternehmen)</w:t>
+              </w:r>
+            </w:ins>
+          </w:p>
+        </w:tc>
+        <w:tc>
+          <w:tcPr>
+            <w:tcW w:w="2998" w:type="dxa"/>
+          </w:tcPr>
+          <w:p>
+            <w:pPr>
+              <w:pStyle w:val="Compact"/>
+              <w:rPr>
+                <w:ins w:id="12341" w:author="Claude" w:date="2026-10-25T13:49:46Z"/>
+              </w:rPr>
+            </w:pPr>
+            <w:ins w:id="12342" w:author="Claude" w:date="2026-10-25T13:49:46Z">
+              <w:r>
+                <w:t xml:space="preserve">Prüfnachweise, Feststellungen</w:t>
+              </w:r>
+            </w:ins>
+          </w:p>
+        </w:tc>
+      </w:tr>
+      <w:tr>
+        <w:trPr>
+          <w:cantSplit/>
+          <w:ins w:id="12343" w:author="Claude" w:date="2026-10-25T13:49:46Z"/>
+        </w:trPr>
+        <w:tc>
+          <w:tcPr>
+            <w:tcW w:w="3300" w:type="dxa"/>
+          </w:tcPr>
+          <w:p>
+            <w:pPr>
+              <w:pStyle w:val="Compact"/>
+              <w:rPr>
+                <w:ins w:id="12344" w:author="Claude" w:date="2026-10-25T13:49:46Z"/>
+              </w:rPr>
+            </w:pPr>
+            <w:ins w:id="12345" w:author="Claude" w:date="2026-10-25T13:49:46Z">
+              <w:r>
+                <w:t xml:space="preserve">E-04  Bericht und Aktualisierung des Prüfscopes</w:t>
+              </w:r>
+            </w:ins>
+          </w:p>
+        </w:tc>
+        <w:tc>
+          <w:tcPr>
+            <w:tcW w:w="2650" w:type="dxa"/>
+          </w:tcPr>
+          <w:p>
+            <w:pPr>
+              <w:pStyle w:val="Compact"/>
+              <w:rPr>
+                <w:ins w:id="12346" w:author="Claude" w:date="2026-10-25T13:49:46Z"/>
+              </w:rPr>
+            </w:pPr>
+            <w:ins w:id="12347" w:author="Claude" w:date="2026-10-25T13:49:46Z">
+              <w:r>
+                <w:t xml:space="preserve">CADIS®-Fachbereich (Mitwirkung: Auditor)</w:t>
+              </w:r>
+            </w:ins>
+          </w:p>
+        </w:tc>
+        <w:tc>
+          <w:tcPr>
+            <w:tcW w:w="2998" w:type="dxa"/>
+          </w:tcPr>
+          <w:p>
+            <w:pPr>
+              <w:pStyle w:val="Compact"/>
+              <w:rPr>
+                <w:ins w:id="12348" w:author="Claude" w:date="2026-10-25T13:49:46Z"/>
+              </w:rPr>
+            </w:pPr>
+            <w:ins w:id="12349" w:author="Claude" w:date="2026-10-25T13:49:46Z">
+              <w:r>
+                <w:t xml:space="preserve">Bericht, erweiterter Prüfscope</w:t>
+              </w:r>
+            </w:ins>
+          </w:p>
+        </w:tc>
+      </w:tr>
+    </w:tbl>
+    <w:p>
+      <w:pPr>
+        <w:pStyle w:val="Textkrper1"/>
+        <w:rPr>
+          <w:ins w:id="12350" w:author="Claude" w:date="2026-10-25T13:49:46Z"/>
+        </w:rPr>
+      </w:pPr>
+      <w:ins w:id="12351" w:author="Claude" w:date="2026-10-25T13:49:46Z"/>
+    </w:p>
+    <w:p>
+      <w:pPr>
         <w:pStyle w:val="berschrift1"/>
       </w:pPr>
       <w:bookmarkStart w:id="27" w:name="_Toc238102106"/>
@@ -4173,7 +7191,7 @@
         <w:lastRenderedPageBreak/>
         <w:drawing>
           <wp:inline distT="0" distB="0" distL="0" distR="0" wp14:anchorId="30A65F97" wp14:editId="79ADE617">
-            <wp:extent cx="5676900" cy="5080098"/>
+            <wp:extent cx="5676900" cy="5349387"/>
             <wp:effectExtent l="0" t="0" r="0" b="0"/>
             <wp:docPr id="37" name="Picture" descr="Abbildung 2: Ablauf der Erstprüfung"/>
             <wp:cNvGraphicFramePr/>
@@ -4195,7 +7213,7 @@
                   <pic:spPr bwMode="auto">
                     <a:xfrm>
                       <a:off x="0" y="0"/>
-                      <a:ext cx="5676900" cy="5080098"/>
+                      <a:ext cx="5676900" cy="5349387"/>
                     </a:xfrm>
                     <a:prstGeom prst="rect">
                       <a:avLst/>
@@ -5145,7 +8163,7 @@
         </w:rPr>
         <w:drawing>
           <wp:inline distT="0" distB="0" distL="0" distR="0" wp14:anchorId="1F60F013" wp14:editId="64E6DC25">
-            <wp:extent cx="5676900" cy="4148504"/>
+            <wp:extent cx="5676900" cy="4882134"/>
             <wp:effectExtent l="0" t="0" r="0" b="0"/>
             <wp:docPr id="44" name="Picture" descr="Abbildung 3: Ablauf der Maßnahmenplanbewertung und des Follow-Ups"/>
             <wp:cNvGraphicFramePr/>
@@ -5167,7 +8185,7 @@
                   <pic:spPr bwMode="auto">
                     <a:xfrm>
                       <a:off x="0" y="0"/>
-                      <a:ext cx="5676900" cy="4148504"/>
+                      <a:ext cx="5676900" cy="4882134"/>
                     </a:xfrm>
                     <a:prstGeom prst="rect">
                       <a:avLst/>
@@ -5828,7 +8846,7 @@
         </w:rPr>
         <w:drawing>
           <wp:inline distT="0" distB="0" distL="0" distR="0" wp14:anchorId="07987014" wp14:editId="7E1073AC">
-            <wp:extent cx="5676900" cy="2749657"/>
+            <wp:extent cx="5676900" cy="3221277"/>
             <wp:effectExtent l="0" t="0" r="0" b="0"/>
             <wp:docPr id="55" name="Picture" descr="Abbildung 4: Ablauf der risikobasierten Überwachungsprüfung"/>
             <wp:cNvGraphicFramePr/>
@@ -5850,7 +8868,7 @@
                   <pic:spPr bwMode="auto">
                     <a:xfrm>
                       <a:off x="0" y="0"/>
-                      <a:ext cx="5676900" cy="2749657"/>
+                      <a:ext cx="5676900" cy="3221277"/>
                     </a:xfrm>
                     <a:prstGeom prst="rect">
                       <a:avLst/>
@@ -6545,6 +9563,11 @@
       <w:r>
         <w:t>Nach Ablauf eines vollständigen zweijährigen Prüfzyklus wird im dritten Jahr eine erneute Prüfung durchgeführt. Sie entspricht in Umfang und Anforderungen einer Erstprüfung auf Basis eines neu festzulegenden Prüfscopes und folgt daher den Schritten 01 bis 12 aus Kapitel 4.1.2. Sie begründet einen neuen Prüfzyklus, der vom vorangegangenen Zyklus unabhängig ist.</w:t>
       </w:r>
+      <w:ins w:id="12352" w:author="Claude" w:date="2026-10-25T13:49:46Z">
+        <w:r>
+          <w:t xml:space="preserve"> Für die rechtzeitige Beauftragung ist das geprüfte Unternehmen verantwortlich; ein nahtloser Anschluss an die bisherige Freigabe ist nicht gewährleistet (CADIS®-Handbuch, Kapitel 6.11).</w:t>
+        </w:r>
+      </w:ins>
     </w:p>
     <w:p>
       <w:pPr>
@@ -6589,6 +9612,59 @@
       <w:r>
         <w:t xml:space="preserve">Umfasst der Prüfscope mehrere Standorte, gelten zusätzlich die Regelungen des CADIS®-Handbuchs, Kapitel 11. Sie betreffen insbesondere die Voraussetzungen für den Multi-Site-Ansatz, die Klassifizierung des Hauptstandorts, die Stichprobenberechnung, die risikobasierte Stichprobenauswahl, die standortbezogene Prüfpunktauswahl, die Erweiterung der Stichprobe sowie die Ergebnisdarstellung. Der in Kapitel 4.1.2 beschriebene Ablauf bleibt davon unberührt; die Schritte 05 bis 09 sind je Standort beziehungsweise je Stichprobe anzuwenden, wobei Schritt 05 nur bei LoE 2 und LoE 3 zur Anwendung kommt. Innerhalb eines Prüfscopes gelten für alle Standorte dieselben Prüfmodule und Prüfziele; ein standortabhängig unterschiedlicher Prüfumfang ist nicht zulässig. Die risikobasierte Stichprobenauswahl bestimmt ausschließlich, welche Standorte in welchem Umfang geprüft werden, nicht welche Prüfmodule anzuwenden sind. Je Standort gelten die Stufen der Sonderanforderungen, die dem dort angewendeten Level of Examination zugeordnet sind. Der Multi-Site-Ansatz setzt mindestens zwei Standorte voraus; seine Anwendbarkeit wird im Scopingprozess vor dem Kick-Off festgestellt.</w:t>
       </w:r>
+    </w:p>
+    <w:p>
+      <w:pPr>
+        <w:pStyle w:val="berschrift2"/>
+        <w:rPr>
+          <w:ins w:id="12353" w:author="Claude" w:date="2026-10-25T13:49:46Z"/>
+        </w:rPr>
+      </w:pPr>
+      <w:ins w:id="12354" w:author="Claude" w:date="2026-10-25T13:49:46Z">
+        <w:r>
+          <w:t xml:space="preserve">5.4 Abbruch und Verschiebung</w:t>
+        </w:r>
+      </w:ins>
+    </w:p>
+    <w:p>
+      <w:pPr>
+        <w:pStyle w:val="Textkrper1"/>
+        <w:rPr>
+          <w:ins w:id="12355" w:author="Claude" w:date="2026-10-25T13:49:46Z"/>
+        </w:rPr>
+      </w:pPr>
+      <w:ins w:id="12356" w:author="Claude" w:date="2026-10-25T13:49:46Z">
+        <w:r>
+          <w:rPr>
+            <w:b/>
+            <w:bCs/>
+          </w:rPr>
+          <w:t xml:space="preserve">Abbruch: </w:t>
+        </w:r>
+        <w:r>
+          <w:t xml:space="preserve">Eine Prüfung wird abgebrochen nach dem dritten erfolglosen Einreichungsversuch in Phase 1 sowie insbesondere bei fehlender Mitwirkung, verweigertem Zutritt oder verweigerten Nachweisen, vorgelegten manipulierten Nachweisen und einem nachträglich erkannten Interessenkonflikt. Über den Abbruch entscheidet der Auditor in Abstimmung mit dem CADIS®-Fachbereich (CADIS®-Handbuch, Kapitel 6.13). Ein abgebrochenes Audit führt zu keinem Prüfergebnis und zu keiner Freigabe. Der Auditor reicht die bis dahin vorliegenden Unterlagen über seinen TeamBeam-Account beim CADIS®-Fachbereich ein (Schritt 07). Eine erneute Beauftragung ist als neue Erstprüfung frühestens 3 Monate nach dem Abbruch möglich; die Zählung der Einreichungsversuche beginnt neu.</w:t>
+        </w:r>
+      </w:ins>
+    </w:p>
+    <w:p>
+      <w:pPr>
+        <w:pStyle w:val="Textkrper1"/>
+        <w:rPr>
+          <w:ins w:id="12357" w:author="Claude" w:date="2026-10-25T13:49:46Z"/>
+        </w:rPr>
+      </w:pPr>
+      <w:ins w:id="12358" w:author="Claude" w:date="2026-10-25T13:49:46Z">
+        <w:r>
+          <w:rPr>
+            <w:b/>
+            <w:bCs/>
+          </w:rPr>
+          <w:t xml:space="preserve">Verschiebung: </w:t>
+        </w:r>
+        <w:r>
+          <w:t xml:space="preserve">Eine Verschiebung der Prüfung ist einmalig um höchstens 6 Monate und nur mit nachvollziehbarer Begründung zulässig (z. B. Umorganisation, Sicherheitsvorfall). Wird die Prüfung nicht innerhalb dieser Frist fortgesetzt, gilt sie als abgebrochen. Eine Verschiebung hemmt keine Fristen aus dem Maßnahmenplan, dem Prüfzyklus oder dem Toleranzfenster der Überwachungsprüfung. Beträgt die Verschiebung mehr als 3 Monate, ist der Prüfscope vor Fortsetzung erneut zu bestätigen.</w:t>
+        </w:r>
+      </w:ins>
     </w:p>
     <w:p>
       <w:pPr>

</xml_diff>